<commit_message>
Add week 2, 4, and 5 session labs and update week 6 write-up.
Include new Packet Tracer and lab documents; remove missing week 1 pkt; ignore Office temp files.
</commit_message>
<xml_diff>
--- a/Week_6/Week 6 - Session 6 - Lab/Week 6 - Session 2 - Lab - Security Reasoning Lab- Threat-to-Control Mapping for a Given Infrastructure Brief.docx
+++ b/Week_6/Week 6 - Session 6 - Lab/Week 6 - Session 2 - Lab - Security Reasoning Lab- Threat-to-Control Mapping for a Given Infrastructure Brief.docx
@@ -1,6 +1,6 @@
 
 <file path=word/document.xml><?xml version="1.0" encoding="utf-8"?>
-<w:document xmlns:wpc="http://schemas.microsoft.com/office/word/2010/wordprocessingCanvas" xmlns:cx="http://schemas.microsoft.com/office/drawing/2014/chartex" xmlns:cx1="http://schemas.microsoft.com/office/drawing/2015/9/8/chartex" xmlns:cx2="http://schemas.microsoft.com/office/drawing/2015/10/21/chartex" xmlns:cx3="http://schemas.microsoft.com/office/drawing/2016/5/9/chartex" xmlns:cx4="http://schemas.microsoft.com/office/drawing/2016/5/10/chartex" xmlns:cx5="http://schemas.microsoft.com/office/drawing/2016/5/11/chartex" xmlns:cx6="http://schemas.microsoft.com/office/drawing/2016/5/12/chartex" xmlns:cx7="http://schemas.microsoft.com/office/drawing/2016/5/13/chartex" xmlns:cx8="http://schemas.microsoft.com/office/drawing/2016/5/14/chartex" xmlns:mc="http://schemas.openxmlformats.org/markup-compatibility/2006" xmlns:aink="http://schemas.microsoft.com/office/drawing/2016/ink" xmlns:am3d="http://schemas.microsoft.com/office/drawing/2017/model3d" xmlns:o="urn:schemas-microsoft-com:office:office" xmlns:oel="http://schemas.microsoft.com/office/2019/extlst" xmlns:r="http://schemas.openxmlformats.org/officeDocument/2006/relationships" xmlns:m="http://schemas.openxmlformats.org/officeDocument/2006/math" xmlns:v="urn:schemas-microsoft-com:vml" xmlns:wp14="http://schemas.microsoft.com/office/word/2010/wordprocessingDrawing" xmlns:wp="http://schemas.openxmlformats.org/drawingml/2006/wordprocessingDrawing" xmlns:w10="urn:schemas-microsoft-com:office:word" xmlns:w="http://schemas.openxmlformats.org/wordprocessingml/2006/main" xmlns:w14="http://schemas.microsoft.com/office/word/2010/wordml" xmlns:w15="http://schemas.microsoft.com/office/word/2012/wordml" xmlns:w16cex="http://schemas.microsoft.com/office/word/2018/wordml/cex" xmlns:w16cid="http://schemas.microsoft.com/office/word/2016/wordml/cid" xmlns:w16="http://schemas.microsoft.com/office/word/2018/wordml" xmlns:w16du="http://schemas.microsoft.com/office/word/2023/wordml/word16du" xmlns:w16sdtdh="http://schemas.microsoft.com/office/word/2020/wordml/sdtdatahash" xmlns:w16sdtfl="http://schemas.microsoft.com/office/word/2024/wordml/sdtformatlock" xmlns:w16se="http://schemas.microsoft.com/office/word/2015/wordml/symex" xmlns:wpg="http://schemas.microsoft.com/office/word/2010/wordprocessingGroup" xmlns:wpi="http://schemas.microsoft.com/office/word/2010/wordprocessingInk" xmlns:wne="http://schemas.microsoft.com/office/word/2006/wordml" xmlns:wps="http://schemas.microsoft.com/office/word/2010/wordprocessingShape" mc:Ignorable="w14 w15 w16se w16cid w16 w16cex w16sdtdh w16sdtfl w16du wp14">
+<w:document xmlns:wpc="http://schemas.microsoft.com/office/word/2010/wordprocessingCanvas" xmlns:cx="http://schemas.microsoft.com/office/drawing/2014/chartex" xmlns:cx1="http://schemas.microsoft.com/office/drawing/2015/9/8/chartex" xmlns:cx2="http://schemas.microsoft.com/office/drawing/2015/10/21/chartex" xmlns:cx3="http://schemas.microsoft.com/office/drawing/2016/5/9/chartex" xmlns:cx4="http://schemas.microsoft.com/office/drawing/2016/5/10/chartex" xmlns:cx5="http://schemas.microsoft.com/office/drawing/2016/5/11/chartex" xmlns:cx6="http://schemas.microsoft.com/office/drawing/2016/5/12/chartex" xmlns:cx7="http://schemas.microsoft.com/office/drawing/2016/5/13/chartex" xmlns:cx8="http://schemas.microsoft.com/office/drawing/2016/5/14/chartex" xmlns:mc="http://schemas.openxmlformats.org/markup-compatibility/2006" xmlns:m="http://schemas.openxmlformats.org/officeDocument/2006/math" xmlns:aink="http://schemas.microsoft.com/office/drawing/2016/ink" xmlns:am3d="http://schemas.microsoft.com/office/drawing/2017/model3d" xmlns:oel="http://schemas.microsoft.com/office/2019/extlst" xmlns:r="http://schemas.openxmlformats.org/officeDocument/2006/relationships" xmlns:wp14="http://schemas.microsoft.com/office/word/2010/wordprocessingDrawing" xmlns:wp="http://schemas.openxmlformats.org/drawingml/2006/wordprocessingDrawing" xmlns:wpg="http://schemas.microsoft.com/office/word/2010/wordprocessingGroup" xmlns:wpi="http://schemas.microsoft.com/office/word/2010/wordprocessingInk" xmlns:wps="http://schemas.microsoft.com/office/word/2010/wordprocessingShape" xmlns:o="urn:schemas-microsoft-com:office:office" xmlns:v="urn:schemas-microsoft-com:vml" xmlns:w10="urn:schemas-microsoft-com:office:word" xmlns:w="http://schemas.openxmlformats.org/wordprocessingml/2006/main" xmlns:w14="http://schemas.microsoft.com/office/word/2010/wordml" xmlns:w15="http://schemas.microsoft.com/office/word/2012/wordml" xmlns:w16cex="http://schemas.microsoft.com/office/word/2018/wordml/cex" xmlns:w16cid="http://schemas.microsoft.com/office/word/2016/wordml/cid" xmlns:w16="http://schemas.microsoft.com/office/word/2018/wordml" xmlns:w16sdtdh="http://schemas.microsoft.com/office/word/2020/wordml/sdtdatahash" xmlns:w16sdtfl="http://schemas.microsoft.com/office/word/2024/wordml/sdtformatlock" xmlns:w16se="http://schemas.microsoft.com/office/word/2015/wordml/symex" xmlns:w16du="http://schemas.microsoft.com/office/word/2023/wordml/word16du" xmlns:wne="http://schemas.microsoft.com/office/word/2006/wordml" mc:Ignorable="w14 w15 w16se w16cid w16 w16cex w16sdtdh w16sdtfl w16du wp14">
   <w:body>
     <w:p>
       <w:pPr>
@@ -1882,8 +1882,8 @@
         <w:tblLook w:val="04A0" w:firstRow="1" w:lastRow="0" w:firstColumn="1" w:lastColumn="0" w:noHBand="0" w:noVBand="1"/>
       </w:tblPr>
       <w:tblGrid>
-        <w:gridCol w:w="1996"/>
-        <w:gridCol w:w="6619"/>
+        <w:gridCol w:w="1992"/>
+        <w:gridCol w:w="6623"/>
       </w:tblGrid>
       <w:tr>
         <w:trPr>
@@ -2001,12 +2001,21 @@
           </w:tcPr>
           <w:p>
             <w:pPr>
-              <w:rPr>
-                <w:rFonts w:asciiTheme="minorBidi" w:hAnsiTheme="minorBidi"/>
+              <w:pStyle w:val="p1"/>
+              <w:rPr>
+                <w:rFonts w:ascii="Arial" w:hAnsi="Arial" w:cs="Arial"/>
                 <w:sz w:val="20"/>
                 <w:szCs w:val="20"/>
               </w:rPr>
             </w:pPr>
+            <w:r>
+              <w:rPr>
+                <w:rFonts w:ascii="Arial" w:hAnsi="Arial" w:cs="Arial"/>
+                <w:sz w:val="20"/>
+                <w:szCs w:val="20"/>
+              </w:rPr>
+              <w:t>Staff users, guest Wi-Fi users, administrator / technician using the admin workstation</w:t>
+            </w:r>
           </w:p>
         </w:tc>
       </w:tr>
@@ -2054,12 +2063,21 @@
           </w:tcPr>
           <w:p>
             <w:pPr>
-              <w:rPr>
-                <w:rFonts w:asciiTheme="minorBidi" w:hAnsiTheme="minorBidi"/>
+              <w:pStyle w:val="p1"/>
+              <w:rPr>
+                <w:rFonts w:ascii="Arial" w:hAnsi="Arial" w:cs="Arial"/>
                 <w:sz w:val="20"/>
                 <w:szCs w:val="20"/>
               </w:rPr>
             </w:pPr>
+            <w:r>
+              <w:rPr>
+                <w:rFonts w:ascii="Arial" w:hAnsi="Arial" w:cs="Arial"/>
+                <w:sz w:val="20"/>
+                <w:szCs w:val="20"/>
+              </w:rPr>
+              <w:t>Staff intranet, guest Wi-Fi access, DNS service, DHCP service, remote administration</w:t>
+            </w:r>
           </w:p>
         </w:tc>
       </w:tr>
@@ -2107,12 +2125,21 @@
           </w:tcPr>
           <w:p>
             <w:pPr>
-              <w:rPr>
-                <w:rFonts w:asciiTheme="minorBidi" w:hAnsiTheme="minorBidi"/>
+              <w:pStyle w:val="p1"/>
+              <w:rPr>
+                <w:rFonts w:ascii="Arial" w:hAnsi="Arial" w:cs="Arial"/>
                 <w:sz w:val="20"/>
                 <w:szCs w:val="20"/>
               </w:rPr>
             </w:pPr>
+            <w:r>
+              <w:rPr>
+                <w:rFonts w:ascii="Arial" w:hAnsi="Arial" w:cs="Arial"/>
+                <w:sz w:val="20"/>
+                <w:szCs w:val="20"/>
+              </w:rPr>
+              <w:t>Guest laptop, guest mobile device, access point, access switch, firewall, router, internal switch, staff PCs, staff intranet server, DNS/DHCP server, admin workstation</w:t>
+            </w:r>
           </w:p>
         </w:tc>
       </w:tr>
@@ -2160,12 +2187,21 @@
           </w:tcPr>
           <w:p>
             <w:pPr>
-              <w:rPr>
-                <w:rFonts w:asciiTheme="minorBidi" w:hAnsiTheme="minorBidi"/>
+              <w:pStyle w:val="p1"/>
+              <w:rPr>
+                <w:rFonts w:ascii="Arial" w:hAnsi="Arial" w:cs="Arial"/>
                 <w:sz w:val="20"/>
                 <w:szCs w:val="20"/>
               </w:rPr>
             </w:pPr>
+            <w:r>
+              <w:rPr>
+                <w:rFonts w:ascii="Arial" w:hAnsi="Arial" w:cs="Arial"/>
+                <w:sz w:val="20"/>
+                <w:szCs w:val="20"/>
+              </w:rPr>
+              <w:t>Staff intranet data, DNS records, DHCP settings, IP addressing, router and switch configuration, firewall rules, administrator credentials</w:t>
+            </w:r>
           </w:p>
         </w:tc>
       </w:tr>
@@ -2213,12 +2249,21 @@
           </w:tcPr>
           <w:p>
             <w:pPr>
-              <w:rPr>
-                <w:rFonts w:asciiTheme="minorBidi" w:hAnsiTheme="minorBidi"/>
+              <w:pStyle w:val="p1"/>
+              <w:rPr>
+                <w:rFonts w:ascii="Arial" w:hAnsi="Arial" w:cs="Arial"/>
                 <w:sz w:val="20"/>
                 <w:szCs w:val="20"/>
               </w:rPr>
             </w:pPr>
+            <w:r>
+              <w:rPr>
+                <w:rFonts w:ascii="Arial" w:hAnsi="Arial" w:cs="Arial"/>
+                <w:sz w:val="20"/>
+                <w:szCs w:val="20"/>
+              </w:rPr>
+              <w:t>Guest Wi-Fi network to staff/internal network, firewall/gateway boundary, staff/internal network boundary, admin workstation to router management path, user access versus administrator access</w:t>
+            </w:r>
           </w:p>
         </w:tc>
       </w:tr>
@@ -2269,16 +2314,19 @@
     </w:p>
     <w:p>
       <w:pPr>
-        <w:spacing w:after="40" w:line="240" w:lineRule="auto"/>
-        <w:rPr>
-          <w:rFonts w:asciiTheme="minorBidi" w:hAnsiTheme="minorBidi"/>
-        </w:rPr>
-      </w:pPr>
-      <w:r>
-        <w:rPr>
-          <w:rFonts w:asciiTheme="minorBidi" w:hAnsiTheme="minorBidi"/>
-        </w:rPr>
-        <w:t>Answer: _______________________________________________________________________</w:t>
+        <w:pStyle w:val="p1"/>
+      </w:pPr>
+      <w:r>
+        <w:rPr>
+          <w:rFonts w:asciiTheme="minorBidi" w:hAnsiTheme="minorBidi"/>
+        </w:rPr>
+        <w:t xml:space="preserve">Answer: </w:t>
+      </w:r>
+      <w:r>
+        <w:rPr>
+          <w:rFonts w:ascii="Arial" w:hAnsi="Arial" w:cs="Arial"/>
+        </w:rPr>
+        <w:t>It is important because security controls should be chosen to protect specific assets and services. If the organisation does not first identify what needs protection, it is difficult to decide which risks matter and which controls are suitable.</w:t>
       </w:r>
     </w:p>
     <w:p>
@@ -2301,16 +2349,19 @@
     </w:p>
     <w:p>
       <w:pPr>
-        <w:spacing w:after="40" w:line="240" w:lineRule="auto"/>
-        <w:rPr>
-          <w:rFonts w:asciiTheme="minorBidi" w:hAnsiTheme="minorBidi"/>
-        </w:rPr>
-      </w:pPr>
-      <w:r>
-        <w:rPr>
-          <w:rFonts w:asciiTheme="minorBidi" w:hAnsiTheme="minorBidi"/>
-        </w:rPr>
-        <w:t>Answer: _______________________________________________________________________</w:t>
+        <w:pStyle w:val="p1"/>
+      </w:pPr>
+      <w:r>
+        <w:rPr>
+          <w:rFonts w:asciiTheme="minorBidi" w:hAnsiTheme="minorBidi"/>
+        </w:rPr>
+        <w:t xml:space="preserve">Answer: </w:t>
+      </w:r>
+      <w:r>
+        <w:rPr>
+          <w:rFonts w:ascii="Arial" w:hAnsi="Arial" w:cs="Arial"/>
+        </w:rPr>
+        <w:t>Guest users and staff users should not automatically have the same access because they have different levels of trust and different business needs. Staff users may need access to internal systems such as the staff intranet, but guest users normally only need limited access, such as Wi-Fi or internet access.</w:t>
       </w:r>
     </w:p>
     <w:p>
@@ -2333,16 +2384,19 @@
     </w:p>
     <w:p>
       <w:pPr>
-        <w:spacing w:after="40" w:line="240" w:lineRule="auto"/>
-        <w:rPr>
-          <w:rFonts w:asciiTheme="minorBidi" w:hAnsiTheme="minorBidi"/>
-        </w:rPr>
-      </w:pPr>
-      <w:r>
-        <w:rPr>
-          <w:rFonts w:asciiTheme="minorBidi" w:hAnsiTheme="minorBidi"/>
-        </w:rPr>
-        <w:t>Answer: _______________________________________________________________________</w:t>
+        <w:pStyle w:val="p1"/>
+      </w:pPr>
+      <w:r>
+        <w:rPr>
+          <w:rFonts w:asciiTheme="minorBidi" w:hAnsiTheme="minorBidi"/>
+        </w:rPr>
+        <w:t xml:space="preserve">Answer: </w:t>
+      </w:r>
+      <w:r>
+        <w:rPr>
+          <w:rFonts w:ascii="Arial" w:hAnsi="Arial" w:cs="Arial"/>
+        </w:rPr>
+        <w:t>Configuration trust is involved in the router, firewall, switches, DNS/DHCP service, staff intranet server, remote administration settings, IP addressing, access rules, and administrator credentials. These configurations must be trusted because incorrect or unauthorised changes could affect access, security, or service availability.</w:t>
       </w:r>
     </w:p>
     <w:p>
@@ -2494,6 +2548,7 @@
           <w:rFonts w:asciiTheme="minorBidi" w:hAnsiTheme="minorBidi"/>
           <w:sz w:val="22"/>
         </w:rPr>
+        <w:lastRenderedPageBreak/>
         <w:t>unnecessary services are enabled</w:t>
       </w:r>
     </w:p>
@@ -2692,8 +2747,8 @@
         <w:tblLook w:val="04A0" w:firstRow="1" w:lastRow="0" w:firstColumn="1" w:lastColumn="0" w:noHBand="0" w:noVBand="1"/>
       </w:tblPr>
       <w:tblGrid>
-        <w:gridCol w:w="3172"/>
-        <w:gridCol w:w="5580"/>
+        <w:gridCol w:w="3173"/>
+        <w:gridCol w:w="5579"/>
       </w:tblGrid>
       <w:tr>
         <w:trPr>
@@ -2783,12 +2838,17 @@
           </w:tcPr>
           <w:p>
             <w:pPr>
-              <w:rPr>
-                <w:rFonts w:asciiTheme="minorBidi" w:hAnsiTheme="minorBidi"/>
-                <w:sz w:val="20"/>
-                <w:szCs w:val="20"/>
+              <w:pStyle w:val="p1"/>
+              <w:rPr>
+                <w:rFonts w:ascii="Arial" w:hAnsi="Arial" w:cs="Arial"/>
               </w:rPr>
             </w:pPr>
+            <w:r>
+              <w:rPr>
+                <w:rFonts w:ascii="Arial" w:hAnsi="Arial" w:cs="Arial"/>
+              </w:rPr>
+              <w:t>Guest Wi-Fi can reach the staff intranet</w:t>
+            </w:r>
           </w:p>
         </w:tc>
         <w:tc>
@@ -2803,12 +2863,17 @@
           </w:tcPr>
           <w:p>
             <w:pPr>
-              <w:rPr>
-                <w:rFonts w:asciiTheme="minorBidi" w:hAnsiTheme="minorBidi"/>
-                <w:sz w:val="20"/>
-                <w:szCs w:val="20"/>
+              <w:pStyle w:val="p1"/>
+              <w:rPr>
+                <w:rFonts w:ascii="Arial" w:hAnsi="Arial" w:cs="Arial"/>
               </w:rPr>
             </w:pPr>
+            <w:r>
+              <w:rPr>
+                <w:rFonts w:ascii="Arial" w:hAnsi="Arial" w:cs="Arial"/>
+              </w:rPr>
+              <w:t>Guest users are less trusted than staff users, so allowing them to reach internal staff services could increase the risk of unauthorised access.</w:t>
+            </w:r>
           </w:p>
         </w:tc>
       </w:tr>
@@ -2828,8 +2893,22 @@
           </w:tcPr>
           <w:p>
             <w:pPr>
-              <w:rPr>
-                <w:rFonts w:asciiTheme="minorBidi" w:hAnsiTheme="minorBidi"/>
+              <w:pStyle w:val="p1"/>
+              <w:rPr>
+                <w:rFonts w:ascii="Arial" w:hAnsi="Arial" w:cs="Arial"/>
+              </w:rPr>
+            </w:pPr>
+            <w:r>
+              <w:rPr>
+                <w:rFonts w:ascii="Arial" w:hAnsi="Arial" w:cs="Arial"/>
+              </w:rPr>
+              <w:t>Remote administration may be unprotected</w:t>
+            </w:r>
+          </w:p>
+          <w:p>
+            <w:pPr>
+              <w:rPr>
+                <w:rFonts w:ascii="Arial" w:hAnsi="Arial" w:cs="Arial"/>
                 <w:sz w:val="20"/>
                 <w:szCs w:val="20"/>
               </w:rPr>
@@ -2848,12 +2927,17 @@
           </w:tcPr>
           <w:p>
             <w:pPr>
-              <w:rPr>
-                <w:rFonts w:asciiTheme="minorBidi" w:hAnsiTheme="minorBidi"/>
-                <w:sz w:val="20"/>
-                <w:szCs w:val="20"/>
+              <w:pStyle w:val="p1"/>
+              <w:rPr>
+                <w:rFonts w:ascii="Arial" w:hAnsi="Arial" w:cs="Arial"/>
               </w:rPr>
             </w:pPr>
+            <w:r>
+              <w:rPr>
+                <w:rFonts w:ascii="Arial" w:hAnsi="Arial" w:cs="Arial"/>
+              </w:rPr>
+              <w:t>Remote administration may include usernames, passwords, commands and configuration changes. If it is not protected, management traffic could be exposed or misused.</w:t>
+            </w:r>
           </w:p>
         </w:tc>
       </w:tr>
@@ -2873,12 +2957,17 @@
           </w:tcPr>
           <w:p>
             <w:pPr>
-              <w:rPr>
-                <w:rFonts w:asciiTheme="minorBidi" w:hAnsiTheme="minorBidi"/>
-                <w:sz w:val="20"/>
-                <w:szCs w:val="20"/>
+              <w:pStyle w:val="p1"/>
+              <w:rPr>
+                <w:rFonts w:ascii="Arial" w:hAnsi="Arial" w:cs="Arial"/>
               </w:rPr>
             </w:pPr>
+            <w:r>
+              <w:rPr>
+                <w:rFonts w:ascii="Arial" w:hAnsi="Arial" w:cs="Arial"/>
+              </w:rPr>
+              <w:t>Administrator access may be shared or poorly controlled</w:t>
+            </w:r>
           </w:p>
         </w:tc>
         <w:tc>
@@ -2893,12 +2982,17 @@
           </w:tcPr>
           <w:p>
             <w:pPr>
-              <w:rPr>
-                <w:rFonts w:asciiTheme="minorBidi" w:hAnsiTheme="minorBidi"/>
-                <w:sz w:val="20"/>
-                <w:szCs w:val="20"/>
+              <w:pStyle w:val="p1"/>
+              <w:rPr>
+                <w:rFonts w:ascii="Arial" w:hAnsi="Arial" w:cs="Arial"/>
               </w:rPr>
             </w:pPr>
+            <w:r>
+              <w:rPr>
+                <w:rFonts w:ascii="Arial" w:hAnsi="Arial" w:cs="Arial"/>
+              </w:rPr>
+              <w:t>If administrator access is too broad or shared, it becomes harder to trace who made changes, and one account may have more privileges than needed.</w:t>
+            </w:r>
           </w:p>
         </w:tc>
       </w:tr>
@@ -2918,12 +3012,17 @@
           </w:tcPr>
           <w:p>
             <w:pPr>
-              <w:rPr>
-                <w:rFonts w:asciiTheme="minorBidi" w:hAnsiTheme="minorBidi"/>
-                <w:sz w:val="20"/>
-                <w:szCs w:val="20"/>
+              <w:pStyle w:val="p1"/>
+              <w:rPr>
+                <w:rFonts w:ascii="Arial" w:hAnsi="Arial" w:cs="Arial"/>
               </w:rPr>
             </w:pPr>
+            <w:r>
+              <w:rPr>
+                <w:rFonts w:ascii="Arial" w:hAnsi="Arial" w:cs="Arial"/>
+              </w:rPr>
+              <w:t>DNS/DHCP settings may be weakly controlled</w:t>
+            </w:r>
           </w:p>
         </w:tc>
         <w:tc>
@@ -2938,12 +3037,17 @@
           </w:tcPr>
           <w:p>
             <w:pPr>
-              <w:rPr>
-                <w:rFonts w:asciiTheme="minorBidi" w:hAnsiTheme="minorBidi"/>
-                <w:sz w:val="20"/>
-                <w:szCs w:val="20"/>
+              <w:pStyle w:val="p1"/>
+              <w:rPr>
+                <w:rFonts w:ascii="Arial" w:hAnsi="Arial" w:cs="Arial"/>
               </w:rPr>
             </w:pPr>
+            <w:r>
+              <w:rPr>
+                <w:rFonts w:ascii="Arial" w:hAnsi="Arial" w:cs="Arial"/>
+              </w:rPr>
+              <w:t>DNS and DHCP support normal network access. Weak control could cause incorrect addressing, service disruption, or users being directed to the wrong services.</w:t>
+            </w:r>
           </w:p>
         </w:tc>
       </w:tr>
@@ -2963,12 +3067,17 @@
           </w:tcPr>
           <w:p>
             <w:pPr>
-              <w:rPr>
-                <w:rFonts w:asciiTheme="minorBidi" w:hAnsiTheme="minorBidi"/>
-                <w:sz w:val="20"/>
-                <w:szCs w:val="20"/>
+              <w:pStyle w:val="p1"/>
+              <w:rPr>
+                <w:rFonts w:ascii="Arial" w:hAnsi="Arial" w:cs="Arial"/>
               </w:rPr>
             </w:pPr>
+            <w:r>
+              <w:rPr>
+                <w:rFonts w:ascii="Arial" w:hAnsi="Arial" w:cs="Arial"/>
+              </w:rPr>
+              <w:t>No clear backup or recovery plan is shown</w:t>
+            </w:r>
           </w:p>
         </w:tc>
         <w:tc>
@@ -2983,12 +3092,17 @@
           </w:tcPr>
           <w:p>
             <w:pPr>
-              <w:rPr>
-                <w:rFonts w:asciiTheme="minorBidi" w:hAnsiTheme="minorBidi"/>
-                <w:sz w:val="20"/>
-                <w:szCs w:val="20"/>
+              <w:pStyle w:val="p1"/>
+              <w:rPr>
+                <w:rFonts w:ascii="Arial" w:hAnsi="Arial" w:cs="Arial"/>
               </w:rPr>
             </w:pPr>
+            <w:r>
+              <w:rPr>
+                <w:rFonts w:ascii="Arial" w:hAnsi="Arial" w:cs="Arial"/>
+              </w:rPr>
+              <w:t>If data is lost or a service fails, the organisation may not be able to restore systems quickly, affecting availability.</w:t>
+            </w:r>
           </w:p>
         </w:tc>
       </w:tr>
@@ -3107,11 +3221,11 @@
         <w:tblLook w:val="04A0" w:firstRow="1" w:lastRow="0" w:firstColumn="1" w:lastColumn="0" w:noHBand="0" w:noVBand="1"/>
       </w:tblPr>
       <w:tblGrid>
-        <w:gridCol w:w="1730"/>
-        <w:gridCol w:w="2552"/>
-        <w:gridCol w:w="1729"/>
-        <w:gridCol w:w="1434"/>
-        <w:gridCol w:w="2183"/>
+        <w:gridCol w:w="1775"/>
+        <w:gridCol w:w="2456"/>
+        <w:gridCol w:w="1778"/>
+        <w:gridCol w:w="1477"/>
+        <w:gridCol w:w="2142"/>
       </w:tblGrid>
       <w:tr>
         <w:trPr>
@@ -3301,14 +3415,14 @@
           <w:p>
             <w:pPr>
               <w:rPr>
-                <w:rFonts w:asciiTheme="minorBidi" w:hAnsiTheme="minorBidi"/>
+                <w:rFonts w:ascii="Arial" w:hAnsi="Arial" w:cs="Arial"/>
                 <w:sz w:val="20"/>
                 <w:szCs w:val="20"/>
               </w:rPr>
             </w:pPr>
             <w:r>
               <w:rPr>
-                <w:rFonts w:asciiTheme="minorBidi" w:hAnsiTheme="minorBidi"/>
+                <w:rFonts w:ascii="Arial" w:hAnsi="Arial" w:cs="Arial"/>
                 <w:sz w:val="20"/>
                 <w:szCs w:val="20"/>
               </w:rPr>
@@ -3328,12 +3442,21 @@
           </w:tcPr>
           <w:p>
             <w:pPr>
-              <w:rPr>
-                <w:rFonts w:asciiTheme="minorBidi" w:hAnsiTheme="minorBidi"/>
+              <w:pStyle w:val="p1"/>
+              <w:rPr>
+                <w:rFonts w:ascii="Arial" w:hAnsi="Arial" w:cs="Arial"/>
                 <w:sz w:val="20"/>
                 <w:szCs w:val="20"/>
               </w:rPr>
             </w:pPr>
+            <w:r>
+              <w:rPr>
+                <w:rFonts w:ascii="Arial" w:hAnsi="Arial" w:cs="Arial"/>
+                <w:sz w:val="20"/>
+                <w:szCs w:val="20"/>
+              </w:rPr>
+              <w:t>Guest Wi-Fi can reach the staff intranet login page</w:t>
+            </w:r>
           </w:p>
         </w:tc>
         <w:tc>
@@ -3348,12 +3471,21 @@
           </w:tcPr>
           <w:p>
             <w:pPr>
-              <w:rPr>
-                <w:rFonts w:asciiTheme="minorBidi" w:hAnsiTheme="minorBidi"/>
+              <w:pStyle w:val="p1"/>
+              <w:rPr>
+                <w:rFonts w:ascii="Arial" w:hAnsi="Arial" w:cs="Arial"/>
                 <w:sz w:val="20"/>
                 <w:szCs w:val="20"/>
               </w:rPr>
             </w:pPr>
+            <w:r>
+              <w:rPr>
+                <w:rFonts w:ascii="Arial" w:hAnsi="Arial" w:cs="Arial"/>
+                <w:sz w:val="20"/>
+                <w:szCs w:val="20"/>
+              </w:rPr>
+              <w:t>Unauthorised access</w:t>
+            </w:r>
           </w:p>
         </w:tc>
         <w:tc>
@@ -3368,12 +3500,21 @@
           </w:tcPr>
           <w:p>
             <w:pPr>
-              <w:rPr>
-                <w:rFonts w:asciiTheme="minorBidi" w:hAnsiTheme="minorBidi"/>
+              <w:pStyle w:val="p1"/>
+              <w:rPr>
+                <w:rFonts w:ascii="Arial" w:hAnsi="Arial" w:cs="Arial"/>
                 <w:sz w:val="20"/>
                 <w:szCs w:val="20"/>
               </w:rPr>
             </w:pPr>
+            <w:r>
+              <w:rPr>
+                <w:rFonts w:ascii="Arial" w:hAnsi="Arial" w:cs="Arial"/>
+                <w:sz w:val="20"/>
+                <w:szCs w:val="20"/>
+              </w:rPr>
+              <w:t>Confidentiality / Integrity</w:t>
+            </w:r>
           </w:p>
         </w:tc>
         <w:tc>
@@ -3388,12 +3529,21 @@
           </w:tcPr>
           <w:p>
             <w:pPr>
-              <w:rPr>
-                <w:rFonts w:asciiTheme="minorBidi" w:hAnsiTheme="minorBidi"/>
+              <w:pStyle w:val="p1"/>
+              <w:rPr>
+                <w:rFonts w:ascii="Arial" w:hAnsi="Arial" w:cs="Arial"/>
                 <w:sz w:val="20"/>
                 <w:szCs w:val="20"/>
               </w:rPr>
             </w:pPr>
+            <w:r>
+              <w:rPr>
+                <w:rFonts w:ascii="Arial" w:hAnsi="Arial" w:cs="Arial"/>
+                <w:sz w:val="20"/>
+                <w:szCs w:val="20"/>
+              </w:rPr>
+              <w:t>Guest users may attempt to access internal staff information or interact with services they should not use.</w:t>
+            </w:r>
           </w:p>
         </w:tc>
       </w:tr>
@@ -3414,14 +3564,14 @@
           <w:p>
             <w:pPr>
               <w:rPr>
-                <w:rFonts w:asciiTheme="minorBidi" w:hAnsiTheme="minorBidi"/>
+                <w:rFonts w:ascii="Arial" w:hAnsi="Arial" w:cs="Arial"/>
                 <w:sz w:val="20"/>
                 <w:szCs w:val="20"/>
               </w:rPr>
             </w:pPr>
             <w:r>
               <w:rPr>
-                <w:rFonts w:asciiTheme="minorBidi" w:hAnsiTheme="minorBidi"/>
+                <w:rFonts w:ascii="Arial" w:hAnsi="Arial" w:cs="Arial"/>
                 <w:sz w:val="20"/>
                 <w:szCs w:val="20"/>
               </w:rPr>
@@ -3441,12 +3591,21 @@
           </w:tcPr>
           <w:p>
             <w:pPr>
-              <w:rPr>
-                <w:rFonts w:asciiTheme="minorBidi" w:hAnsiTheme="minorBidi"/>
+              <w:pStyle w:val="p1"/>
+              <w:rPr>
+                <w:rFonts w:ascii="Arial" w:hAnsi="Arial" w:cs="Arial"/>
                 <w:sz w:val="20"/>
                 <w:szCs w:val="20"/>
               </w:rPr>
             </w:pPr>
+            <w:r>
+              <w:rPr>
+                <w:rFonts w:ascii="Arial" w:hAnsi="Arial" w:cs="Arial"/>
+                <w:sz w:val="20"/>
+                <w:szCs w:val="20"/>
+              </w:rPr>
+              <w:t>Remote administration is available, but it is not clear whether the traffic is protected</w:t>
+            </w:r>
           </w:p>
         </w:tc>
         <w:tc>
@@ -3461,12 +3620,21 @@
           </w:tcPr>
           <w:p>
             <w:pPr>
-              <w:rPr>
-                <w:rFonts w:asciiTheme="minorBidi" w:hAnsiTheme="minorBidi"/>
+              <w:pStyle w:val="p1"/>
+              <w:rPr>
+                <w:rFonts w:ascii="Arial" w:hAnsi="Arial" w:cs="Arial"/>
                 <w:sz w:val="20"/>
                 <w:szCs w:val="20"/>
               </w:rPr>
             </w:pPr>
+            <w:r>
+              <w:rPr>
+                <w:rFonts w:ascii="Arial" w:hAnsi="Arial" w:cs="Arial"/>
+                <w:sz w:val="20"/>
+                <w:szCs w:val="20"/>
+              </w:rPr>
+              <w:t>Credential exposure / Privilege misuse</w:t>
+            </w:r>
           </w:p>
         </w:tc>
         <w:tc>
@@ -3481,12 +3649,21 @@
           </w:tcPr>
           <w:p>
             <w:pPr>
-              <w:rPr>
-                <w:rFonts w:asciiTheme="minorBidi" w:hAnsiTheme="minorBidi"/>
+              <w:pStyle w:val="p1"/>
+              <w:rPr>
+                <w:rFonts w:ascii="Arial" w:hAnsi="Arial" w:cs="Arial"/>
                 <w:sz w:val="20"/>
                 <w:szCs w:val="20"/>
               </w:rPr>
             </w:pPr>
+            <w:r>
+              <w:rPr>
+                <w:rFonts w:ascii="Arial" w:hAnsi="Arial" w:cs="Arial"/>
+                <w:sz w:val="20"/>
+                <w:szCs w:val="20"/>
+              </w:rPr>
+              <w:t>Confidentiality / Integrity</w:t>
+            </w:r>
           </w:p>
         </w:tc>
         <w:tc>
@@ -3501,12 +3678,21 @@
           </w:tcPr>
           <w:p>
             <w:pPr>
-              <w:rPr>
-                <w:rFonts w:asciiTheme="minorBidi" w:hAnsiTheme="minorBidi"/>
+              <w:pStyle w:val="p1"/>
+              <w:rPr>
+                <w:rFonts w:ascii="Arial" w:hAnsi="Arial" w:cs="Arial"/>
                 <w:sz w:val="20"/>
                 <w:szCs w:val="20"/>
               </w:rPr>
             </w:pPr>
+            <w:r>
+              <w:rPr>
+                <w:rFonts w:ascii="Arial" w:hAnsi="Arial" w:cs="Arial"/>
+                <w:sz w:val="20"/>
+                <w:szCs w:val="20"/>
+              </w:rPr>
+              <w:t>Administrator credentials or management commands could be exposed or misused, leading to unauthorised configuration changes.</w:t>
+            </w:r>
           </w:p>
         </w:tc>
       </w:tr>
@@ -3527,14 +3713,14 @@
           <w:p>
             <w:pPr>
               <w:rPr>
-                <w:rFonts w:asciiTheme="minorBidi" w:hAnsiTheme="minorBidi"/>
+                <w:rFonts w:ascii="Arial" w:hAnsi="Arial" w:cs="Arial"/>
                 <w:sz w:val="20"/>
                 <w:szCs w:val="20"/>
               </w:rPr>
             </w:pPr>
             <w:r>
               <w:rPr>
-                <w:rFonts w:asciiTheme="minorBidi" w:hAnsiTheme="minorBidi"/>
+                <w:rFonts w:ascii="Arial" w:hAnsi="Arial" w:cs="Arial"/>
                 <w:sz w:val="20"/>
                 <w:szCs w:val="20"/>
               </w:rPr>
@@ -3554,12 +3740,21 @@
           </w:tcPr>
           <w:p>
             <w:pPr>
-              <w:rPr>
-                <w:rFonts w:asciiTheme="minorBidi" w:hAnsiTheme="minorBidi"/>
+              <w:pStyle w:val="p1"/>
+              <w:rPr>
+                <w:rFonts w:ascii="Arial" w:hAnsi="Arial" w:cs="Arial"/>
                 <w:sz w:val="20"/>
                 <w:szCs w:val="20"/>
               </w:rPr>
             </w:pPr>
+            <w:r>
+              <w:rPr>
+                <w:rFonts w:ascii="Arial" w:hAnsi="Arial" w:cs="Arial"/>
+                <w:sz w:val="20"/>
+                <w:szCs w:val="20"/>
+              </w:rPr>
+              <w:t>DNS/DHCP settings may be weakly controlled</w:t>
+            </w:r>
           </w:p>
         </w:tc>
         <w:tc>
@@ -3574,12 +3769,21 @@
           </w:tcPr>
           <w:p>
             <w:pPr>
-              <w:rPr>
-                <w:rFonts w:asciiTheme="minorBidi" w:hAnsiTheme="minorBidi"/>
+              <w:pStyle w:val="p1"/>
+              <w:rPr>
+                <w:rFonts w:ascii="Arial" w:hAnsi="Arial" w:cs="Arial"/>
                 <w:sz w:val="20"/>
                 <w:szCs w:val="20"/>
               </w:rPr>
             </w:pPr>
+            <w:r>
+              <w:rPr>
+                <w:rFonts w:ascii="Arial" w:hAnsi="Arial" w:cs="Arial"/>
+                <w:sz w:val="20"/>
+                <w:szCs w:val="20"/>
+              </w:rPr>
+              <w:t>Misconfiguration / Service disruption</w:t>
+            </w:r>
           </w:p>
         </w:tc>
         <w:tc>
@@ -3594,12 +3798,21 @@
           </w:tcPr>
           <w:p>
             <w:pPr>
-              <w:rPr>
-                <w:rFonts w:asciiTheme="minorBidi" w:hAnsiTheme="minorBidi"/>
+              <w:pStyle w:val="p1"/>
+              <w:rPr>
+                <w:rFonts w:ascii="Arial" w:hAnsi="Arial" w:cs="Arial"/>
                 <w:sz w:val="20"/>
                 <w:szCs w:val="20"/>
               </w:rPr>
             </w:pPr>
+            <w:r>
+              <w:rPr>
+                <w:rFonts w:ascii="Arial" w:hAnsi="Arial" w:cs="Arial"/>
+                <w:sz w:val="20"/>
+                <w:szCs w:val="20"/>
+              </w:rPr>
+              <w:t>Availability / Integrity</w:t>
+            </w:r>
           </w:p>
         </w:tc>
         <w:tc>
@@ -3614,12 +3827,30 @@
           </w:tcPr>
           <w:p>
             <w:pPr>
-              <w:rPr>
-                <w:rFonts w:asciiTheme="minorBidi" w:hAnsiTheme="minorBidi"/>
+              <w:pStyle w:val="p1"/>
+              <w:rPr>
+                <w:rFonts w:ascii="Arial" w:hAnsi="Arial" w:cs="Arial"/>
                 <w:sz w:val="20"/>
                 <w:szCs w:val="20"/>
               </w:rPr>
             </w:pPr>
+            <w:r>
+              <w:rPr>
+                <w:rFonts w:ascii="Arial" w:hAnsi="Arial" w:cs="Arial"/>
+                <w:sz w:val="20"/>
+                <w:szCs w:val="20"/>
+              </w:rPr>
+              <w:t xml:space="preserve">Client devices may receive incorrect network settings, fail </w:t>
+            </w:r>
+            <w:r>
+              <w:rPr>
+                <w:rFonts w:ascii="Arial" w:hAnsi="Arial" w:cs="Arial"/>
+                <w:sz w:val="20"/>
+                <w:szCs w:val="20"/>
+              </w:rPr>
+              <w:lastRenderedPageBreak/>
+              <w:t>to access services, or be directed to the wrong location.</w:t>
+            </w:r>
           </w:p>
         </w:tc>
       </w:tr>
@@ -3640,17 +3871,18 @@
           <w:p>
             <w:pPr>
               <w:rPr>
-                <w:rFonts w:asciiTheme="minorBidi" w:hAnsiTheme="minorBidi"/>
+                <w:rFonts w:ascii="Arial" w:hAnsi="Arial" w:cs="Arial"/>
                 <w:sz w:val="20"/>
                 <w:szCs w:val="20"/>
               </w:rPr>
             </w:pPr>
             <w:r>
               <w:rPr>
-                <w:rFonts w:asciiTheme="minorBidi" w:hAnsiTheme="minorBidi"/>
-                <w:sz w:val="20"/>
-                <w:szCs w:val="20"/>
-              </w:rPr>
+                <w:rFonts w:ascii="Arial" w:hAnsi="Arial" w:cs="Arial"/>
+                <w:sz w:val="20"/>
+                <w:szCs w:val="20"/>
+              </w:rPr>
+              <w:lastRenderedPageBreak/>
               <w:t>Business data or files</w:t>
             </w:r>
           </w:p>
@@ -3667,12 +3899,21 @@
           </w:tcPr>
           <w:p>
             <w:pPr>
-              <w:rPr>
-                <w:rFonts w:asciiTheme="minorBidi" w:hAnsiTheme="minorBidi"/>
+              <w:pStyle w:val="p1"/>
+              <w:rPr>
+                <w:rFonts w:ascii="Arial" w:hAnsi="Arial" w:cs="Arial"/>
                 <w:sz w:val="20"/>
                 <w:szCs w:val="20"/>
               </w:rPr>
             </w:pPr>
+            <w:r>
+              <w:rPr>
+                <w:rFonts w:ascii="Arial" w:hAnsi="Arial" w:cs="Arial"/>
+                <w:sz w:val="20"/>
+                <w:szCs w:val="20"/>
+              </w:rPr>
+              <w:t>No clear backup or recovery plan is shown</w:t>
+            </w:r>
           </w:p>
         </w:tc>
         <w:tc>
@@ -3687,12 +3928,21 @@
           </w:tcPr>
           <w:p>
             <w:pPr>
-              <w:rPr>
-                <w:rFonts w:asciiTheme="minorBidi" w:hAnsiTheme="minorBidi"/>
+              <w:pStyle w:val="p1"/>
+              <w:rPr>
+                <w:rFonts w:ascii="Arial" w:hAnsi="Arial" w:cs="Arial"/>
                 <w:sz w:val="20"/>
                 <w:szCs w:val="20"/>
               </w:rPr>
             </w:pPr>
+            <w:r>
+              <w:rPr>
+                <w:rFonts w:ascii="Arial" w:hAnsi="Arial" w:cs="Arial"/>
+                <w:sz w:val="20"/>
+                <w:szCs w:val="20"/>
+              </w:rPr>
+              <w:t>Data exposure or loss / Service disruption</w:t>
+            </w:r>
           </w:p>
         </w:tc>
         <w:tc>
@@ -3707,12 +3957,21 @@
           </w:tcPr>
           <w:p>
             <w:pPr>
-              <w:rPr>
-                <w:rFonts w:asciiTheme="minorBidi" w:hAnsiTheme="minorBidi"/>
+              <w:pStyle w:val="p1"/>
+              <w:rPr>
+                <w:rFonts w:ascii="Arial" w:hAnsi="Arial" w:cs="Arial"/>
                 <w:sz w:val="20"/>
                 <w:szCs w:val="20"/>
               </w:rPr>
             </w:pPr>
+            <w:r>
+              <w:rPr>
+                <w:rFonts w:ascii="Arial" w:hAnsi="Arial" w:cs="Arial"/>
+                <w:sz w:val="20"/>
+                <w:szCs w:val="20"/>
+              </w:rPr>
+              <w:t>Availability / Integrity</w:t>
+            </w:r>
           </w:p>
         </w:tc>
         <w:tc>
@@ -3727,12 +3986,21 @@
           </w:tcPr>
           <w:p>
             <w:pPr>
-              <w:rPr>
-                <w:rFonts w:asciiTheme="minorBidi" w:hAnsiTheme="minorBidi"/>
+              <w:pStyle w:val="p1"/>
+              <w:rPr>
+                <w:rFonts w:ascii="Arial" w:hAnsi="Arial" w:cs="Arial"/>
                 <w:sz w:val="20"/>
                 <w:szCs w:val="20"/>
               </w:rPr>
             </w:pPr>
+            <w:r>
+              <w:rPr>
+                <w:rFonts w:ascii="Arial" w:hAnsi="Arial" w:cs="Arial"/>
+                <w:sz w:val="20"/>
+                <w:szCs w:val="20"/>
+              </w:rPr>
+              <w:t>Data loss or service failure could cause downtime and make recovery difficult.</w:t>
+            </w:r>
           </w:p>
         </w:tc>
       </w:tr>
@@ -3752,8 +4020,26 @@
           </w:tcPr>
           <w:p>
             <w:pPr>
-              <w:rPr>
-                <w:rFonts w:asciiTheme="minorBidi" w:hAnsiTheme="minorBidi"/>
+              <w:pStyle w:val="p1"/>
+              <w:rPr>
+                <w:rFonts w:ascii="Arial" w:hAnsi="Arial" w:cs="Arial"/>
+                <w:sz w:val="20"/>
+                <w:szCs w:val="20"/>
+              </w:rPr>
+            </w:pPr>
+            <w:r>
+              <w:rPr>
+                <w:rFonts w:ascii="Arial" w:hAnsi="Arial" w:cs="Arial"/>
+                <w:sz w:val="20"/>
+                <w:szCs w:val="20"/>
+              </w:rPr>
+              <w:t>Monitoring/logging</w:t>
+            </w:r>
+          </w:p>
+          <w:p>
+            <w:pPr>
+              <w:rPr>
+                <w:rFonts w:ascii="Arial" w:hAnsi="Arial" w:cs="Arial"/>
                 <w:sz w:val="20"/>
                 <w:szCs w:val="20"/>
               </w:rPr>
@@ -3772,12 +4058,21 @@
           </w:tcPr>
           <w:p>
             <w:pPr>
-              <w:rPr>
-                <w:rFonts w:asciiTheme="minorBidi" w:hAnsiTheme="minorBidi"/>
+              <w:pStyle w:val="p1"/>
+              <w:rPr>
+                <w:rFonts w:ascii="Arial" w:hAnsi="Arial" w:cs="Arial"/>
                 <w:sz w:val="20"/>
                 <w:szCs w:val="20"/>
               </w:rPr>
             </w:pPr>
+            <w:r>
+              <w:rPr>
+                <w:rFonts w:ascii="Arial" w:hAnsi="Arial" w:cs="Arial"/>
+                <w:sz w:val="20"/>
+                <w:szCs w:val="20"/>
+              </w:rPr>
+              <w:t>No clear monitoring or logging evidence is shown</w:t>
+            </w:r>
           </w:p>
         </w:tc>
         <w:tc>
@@ -3792,12 +4087,21 @@
           </w:tcPr>
           <w:p>
             <w:pPr>
-              <w:rPr>
-                <w:rFonts w:asciiTheme="minorBidi" w:hAnsiTheme="minorBidi"/>
+              <w:pStyle w:val="p1"/>
+              <w:rPr>
+                <w:rFonts w:ascii="Arial" w:hAnsi="Arial" w:cs="Arial"/>
                 <w:sz w:val="20"/>
                 <w:szCs w:val="20"/>
               </w:rPr>
             </w:pPr>
+            <w:r>
+              <w:rPr>
+                <w:rFonts w:ascii="Arial" w:hAnsi="Arial" w:cs="Arial"/>
+                <w:sz w:val="20"/>
+                <w:szCs w:val="20"/>
+              </w:rPr>
+              <w:t>Misconfiguration / Unauthorised access</w:t>
+            </w:r>
           </w:p>
         </w:tc>
         <w:tc>
@@ -3812,12 +4116,21 @@
           </w:tcPr>
           <w:p>
             <w:pPr>
-              <w:rPr>
-                <w:rFonts w:asciiTheme="minorBidi" w:hAnsiTheme="minorBidi"/>
+              <w:pStyle w:val="p1"/>
+              <w:rPr>
+                <w:rFonts w:ascii="Arial" w:hAnsi="Arial" w:cs="Arial"/>
                 <w:sz w:val="20"/>
                 <w:szCs w:val="20"/>
               </w:rPr>
             </w:pPr>
+            <w:r>
+              <w:rPr>
+                <w:rFonts w:ascii="Arial" w:hAnsi="Arial" w:cs="Arial"/>
+                <w:sz w:val="20"/>
+                <w:szCs w:val="20"/>
+              </w:rPr>
+              <w:t>Integrity / Availability</w:t>
+            </w:r>
           </w:p>
         </w:tc>
         <w:tc>
@@ -3832,12 +4145,21 @@
           </w:tcPr>
           <w:p>
             <w:pPr>
-              <w:rPr>
-                <w:rFonts w:asciiTheme="minorBidi" w:hAnsiTheme="minorBidi"/>
+              <w:pStyle w:val="p1"/>
+              <w:rPr>
+                <w:rFonts w:ascii="Arial" w:hAnsi="Arial" w:cs="Arial"/>
                 <w:sz w:val="20"/>
                 <w:szCs w:val="20"/>
               </w:rPr>
             </w:pPr>
+            <w:r>
+              <w:rPr>
+                <w:rFonts w:ascii="Arial" w:hAnsi="Arial" w:cs="Arial"/>
+                <w:sz w:val="20"/>
+                <w:szCs w:val="20"/>
+              </w:rPr>
+              <w:t>Faults, misuse or unauthorised access may be harder to detect, investigate or evidence.</w:t>
+            </w:r>
           </w:p>
         </w:tc>
       </w:tr>
@@ -3912,16 +4234,49 @@
     </w:p>
     <w:p>
       <w:pPr>
-        <w:spacing w:after="40" w:line="240" w:lineRule="auto"/>
-        <w:rPr>
-          <w:rFonts w:asciiTheme="minorBidi" w:hAnsiTheme="minorBidi"/>
-        </w:rPr>
-      </w:pPr>
-      <w:r>
-        <w:rPr>
-          <w:rFonts w:asciiTheme="minorBidi" w:hAnsiTheme="minorBidi"/>
-        </w:rPr>
-        <w:t>Answer: _______________________________________________________________________</w:t>
+        <w:pStyle w:val="p1"/>
+      </w:pPr>
+      <w:r>
+        <w:rPr>
+          <w:rFonts w:asciiTheme="minorBidi" w:hAnsiTheme="minorBidi"/>
+        </w:rPr>
+        <w:t xml:space="preserve">Answer: </w:t>
+      </w:r>
+      <w:r>
+        <w:rPr>
+          <w:rFonts w:ascii="Arial" w:hAnsi="Arial" w:cs="Arial"/>
+        </w:rPr>
+        <w:t xml:space="preserve">It is a </w:t>
+      </w:r>
+      <w:r>
+        <w:rPr>
+          <w:rStyle w:val="s1"/>
+          <w:rFonts w:ascii="Arial" w:hAnsi="Arial" w:cs="Arial"/>
+          <w:b/>
+          <w:bCs/>
+        </w:rPr>
+        <w:t>vulnerability / exposed condition</w:t>
+      </w:r>
+      <w:r>
+        <w:rPr>
+          <w:rFonts w:ascii="Arial" w:hAnsi="Arial" w:cs="Arial"/>
+        </w:rPr>
+        <w:t xml:space="preserve"> because it describes a weak access boundary. The threat category is </w:t>
+      </w:r>
+      <w:r>
+        <w:rPr>
+          <w:rStyle w:val="s1"/>
+          <w:rFonts w:ascii="Arial" w:hAnsi="Arial" w:cs="Arial"/>
+          <w:b/>
+          <w:bCs/>
+        </w:rPr>
+        <w:t>unauthorised access</w:t>
+      </w:r>
+      <w:r>
+        <w:rPr>
+          <w:rFonts w:ascii="Arial" w:hAnsi="Arial" w:cs="Arial"/>
+        </w:rPr>
+        <w:t>, and the possible impact is that guest users may access or interfere with internal staff services.</w:t>
       </w:r>
     </w:p>
     <w:p>
@@ -3944,16 +4299,49 @@
     </w:p>
     <w:p>
       <w:pPr>
-        <w:spacing w:after="40" w:line="240" w:lineRule="auto"/>
-        <w:rPr>
-          <w:rFonts w:asciiTheme="minorBidi" w:hAnsiTheme="minorBidi"/>
-        </w:rPr>
-      </w:pPr>
-      <w:r>
-        <w:rPr>
-          <w:rFonts w:asciiTheme="minorBidi" w:hAnsiTheme="minorBidi"/>
-        </w:rPr>
-        <w:t>Answer: _______________________________________________________________________</w:t>
+        <w:pStyle w:val="p1"/>
+      </w:pPr>
+      <w:r>
+        <w:rPr>
+          <w:rFonts w:asciiTheme="minorBidi" w:hAnsiTheme="minorBidi"/>
+        </w:rPr>
+        <w:t xml:space="preserve">Answer: </w:t>
+      </w:r>
+      <w:r>
+        <w:rPr>
+          <w:rFonts w:ascii="Arial" w:hAnsi="Arial" w:cs="Arial"/>
+        </w:rPr>
+        <w:t xml:space="preserve">One exposed condition can affect more than one CIA principle because a single weakness may create different types of harm. For example, guest access to the staff intranet may affect </w:t>
+      </w:r>
+      <w:r>
+        <w:rPr>
+          <w:rStyle w:val="s1"/>
+          <w:rFonts w:ascii="Arial" w:hAnsi="Arial" w:cs="Arial"/>
+          <w:b/>
+          <w:bCs/>
+        </w:rPr>
+        <w:t>confidentiality</w:t>
+      </w:r>
+      <w:r>
+        <w:rPr>
+          <w:rFonts w:ascii="Arial" w:hAnsi="Arial" w:cs="Arial"/>
+        </w:rPr>
+        <w:t xml:space="preserve"> if information is viewed, and </w:t>
+      </w:r>
+      <w:r>
+        <w:rPr>
+          <w:rStyle w:val="s1"/>
+          <w:rFonts w:ascii="Arial" w:hAnsi="Arial" w:cs="Arial"/>
+          <w:b/>
+          <w:bCs/>
+        </w:rPr>
+        <w:t>integrity</w:t>
+      </w:r>
+      <w:r>
+        <w:rPr>
+          <w:rFonts w:ascii="Arial" w:hAnsi="Arial" w:cs="Arial"/>
+        </w:rPr>
+        <w:t xml:space="preserve"> if data or services are changed.</w:t>
       </w:r>
     </w:p>
     <w:p>
@@ -3976,17 +4364,28 @@
     </w:p>
     <w:p>
       <w:pPr>
+        <w:pStyle w:val="p1"/>
+      </w:pPr>
+      <w:r>
+        <w:rPr>
+          <w:rFonts w:asciiTheme="minorBidi" w:hAnsiTheme="minorBidi"/>
+        </w:rPr>
+        <w:t xml:space="preserve">Answer: </w:t>
+      </w:r>
+      <w:r>
+        <w:rPr>
+          <w:rFonts w:ascii="Arial" w:hAnsi="Arial" w:cs="Arial"/>
+        </w:rPr>
+        <w:t>“Security risk” is too vague because it does not explain what is exposed, what could go wrong, which CIA principle is affected, or what the possible impact is. A stronger answer should name the specific issue, such as unauthorised access, credential exposure, misconfiguration, service disruption, or data loss.</w:t>
+      </w:r>
+    </w:p>
+    <w:p>
+      <w:pPr>
         <w:spacing w:after="40" w:line="240" w:lineRule="auto"/>
         <w:rPr>
           <w:rFonts w:asciiTheme="minorBidi" w:hAnsiTheme="minorBidi"/>
         </w:rPr>
       </w:pPr>
-      <w:r>
-        <w:rPr>
-          <w:rFonts w:asciiTheme="minorBidi" w:hAnsiTheme="minorBidi"/>
-        </w:rPr>
-        <w:t>Answer: _______________________________________________________________________</w:t>
-      </w:r>
     </w:p>
     <w:p>
       <w:pPr>
@@ -4163,8 +4562,8 @@
         <w:tblLook w:val="04A0" w:firstRow="1" w:lastRow="0" w:firstColumn="1" w:lastColumn="0" w:noHBand="0" w:noVBand="1"/>
       </w:tblPr>
       <w:tblGrid>
-        <w:gridCol w:w="3048"/>
-        <w:gridCol w:w="3112"/>
+        <w:gridCol w:w="2990"/>
+        <w:gridCol w:w="3170"/>
         <w:gridCol w:w="3468"/>
       </w:tblGrid>
       <w:tr>
@@ -4316,12 +4715,21 @@
           </w:tcPr>
           <w:p>
             <w:pPr>
-              <w:rPr>
-                <w:rFonts w:asciiTheme="minorBidi" w:hAnsiTheme="minorBidi"/>
+              <w:pStyle w:val="p1"/>
+              <w:rPr>
+                <w:rFonts w:ascii="Arial" w:hAnsi="Arial" w:cs="Arial"/>
                 <w:sz w:val="20"/>
                 <w:szCs w:val="20"/>
               </w:rPr>
             </w:pPr>
+            <w:r>
+              <w:rPr>
+                <w:rFonts w:ascii="Arial" w:hAnsi="Arial" w:cs="Arial"/>
+                <w:sz w:val="20"/>
+                <w:szCs w:val="20"/>
+              </w:rPr>
+              <w:t>Separate guest and staff access, with traffic filtering at the internal boundary</w:t>
+            </w:r>
           </w:p>
         </w:tc>
         <w:tc>
@@ -4336,12 +4744,21 @@
           </w:tcPr>
           <w:p>
             <w:pPr>
-              <w:rPr>
-                <w:rFonts w:asciiTheme="minorBidi" w:hAnsiTheme="minorBidi"/>
+              <w:pStyle w:val="p1"/>
+              <w:rPr>
+                <w:rFonts w:ascii="Arial" w:hAnsi="Arial" w:cs="Arial"/>
                 <w:sz w:val="20"/>
                 <w:szCs w:val="20"/>
               </w:rPr>
             </w:pPr>
+            <w:r>
+              <w:rPr>
+                <w:rFonts w:ascii="Arial" w:hAnsi="Arial" w:cs="Arial"/>
+                <w:sz w:val="20"/>
+                <w:szCs w:val="20"/>
+              </w:rPr>
+              <w:t>Guest users should normally only have limited access, such as internet access. Filtering helps prevent less-trusted guest devices from reaching internal staff services.</w:t>
+            </w:r>
           </w:p>
         </w:tc>
       </w:tr>
@@ -4389,12 +4806,21 @@
           </w:tcPr>
           <w:p>
             <w:pPr>
-              <w:rPr>
-                <w:rFonts w:asciiTheme="minorBidi" w:hAnsiTheme="minorBidi"/>
+              <w:pStyle w:val="p1"/>
+              <w:rPr>
+                <w:rFonts w:ascii="Arial" w:hAnsi="Arial" w:cs="Arial"/>
                 <w:sz w:val="20"/>
                 <w:szCs w:val="20"/>
               </w:rPr>
             </w:pPr>
+            <w:r>
+              <w:rPr>
+                <w:rFonts w:ascii="Arial" w:hAnsi="Arial" w:cs="Arial"/>
+                <w:sz w:val="20"/>
+                <w:szCs w:val="20"/>
+              </w:rPr>
+              <w:t>Use protected remote administration, such as SSH, and disable insecure methods such as Telnet</w:t>
+            </w:r>
           </w:p>
         </w:tc>
         <w:tc>
@@ -4409,12 +4835,21 @@
           </w:tcPr>
           <w:p>
             <w:pPr>
-              <w:rPr>
-                <w:rFonts w:asciiTheme="minorBidi" w:hAnsiTheme="minorBidi"/>
+              <w:pStyle w:val="p1"/>
+              <w:rPr>
+                <w:rFonts w:ascii="Arial" w:hAnsi="Arial" w:cs="Arial"/>
                 <w:sz w:val="20"/>
                 <w:szCs w:val="20"/>
               </w:rPr>
             </w:pPr>
+            <w:r>
+              <w:rPr>
+                <w:rFonts w:ascii="Arial" w:hAnsi="Arial" w:cs="Arial"/>
+                <w:sz w:val="20"/>
+                <w:szCs w:val="20"/>
+              </w:rPr>
+              <w:t>Remote administration may include credentials, commands and configuration changes. SSH helps protect management traffic from being exposed.</w:t>
+            </w:r>
           </w:p>
         </w:tc>
       </w:tr>
@@ -4462,12 +4897,21 @@
           </w:tcPr>
           <w:p>
             <w:pPr>
-              <w:rPr>
-                <w:rFonts w:asciiTheme="minorBidi" w:hAnsiTheme="minorBidi"/>
+              <w:pStyle w:val="p1"/>
+              <w:rPr>
+                <w:rFonts w:ascii="Arial" w:hAnsi="Arial" w:cs="Arial"/>
                 <w:sz w:val="20"/>
                 <w:szCs w:val="20"/>
               </w:rPr>
             </w:pPr>
+            <w:r>
+              <w:rPr>
+                <w:rFonts w:ascii="Arial" w:hAnsi="Arial" w:cs="Arial"/>
+                <w:sz w:val="20"/>
+                <w:szCs w:val="20"/>
+              </w:rPr>
+              <w:t>Use named administrator accounts, least privilege, and strong password/account rules</w:t>
+            </w:r>
           </w:p>
         </w:tc>
         <w:tc>
@@ -4482,12 +4926,21 @@
           </w:tcPr>
           <w:p>
             <w:pPr>
-              <w:rPr>
-                <w:rFonts w:asciiTheme="minorBidi" w:hAnsiTheme="minorBidi"/>
+              <w:pStyle w:val="p1"/>
+              <w:rPr>
+                <w:rFonts w:ascii="Arial" w:hAnsi="Arial" w:cs="Arial"/>
                 <w:sz w:val="20"/>
                 <w:szCs w:val="20"/>
               </w:rPr>
             </w:pPr>
+            <w:r>
+              <w:rPr>
+                <w:rFonts w:ascii="Arial" w:hAnsi="Arial" w:cs="Arial"/>
+                <w:sz w:val="20"/>
+                <w:szCs w:val="20"/>
+              </w:rPr>
+              <w:t>Named accounts make administrator activity easier to trace. Least privilege reduces the risk of users having more access than they need.</w:t>
+            </w:r>
           </w:p>
         </w:tc>
       </w:tr>
@@ -4535,12 +4988,21 @@
           </w:tcPr>
           <w:p>
             <w:pPr>
-              <w:rPr>
-                <w:rFonts w:asciiTheme="minorBidi" w:hAnsiTheme="minorBidi"/>
+              <w:pStyle w:val="p1"/>
+              <w:rPr>
+                <w:rFonts w:ascii="Arial" w:hAnsi="Arial" w:cs="Arial"/>
                 <w:sz w:val="20"/>
                 <w:szCs w:val="20"/>
               </w:rPr>
             </w:pPr>
+            <w:r>
+              <w:rPr>
+                <w:rFonts w:ascii="Arial" w:hAnsi="Arial" w:cs="Arial"/>
+                <w:sz w:val="20"/>
+                <w:szCs w:val="20"/>
+              </w:rPr>
+              <w:t>Create a backup and recovery plan, including regular backups and restore testing</w:t>
+            </w:r>
           </w:p>
         </w:tc>
         <w:tc>
@@ -4555,12 +5017,21 @@
           </w:tcPr>
           <w:p>
             <w:pPr>
-              <w:rPr>
-                <w:rFonts w:asciiTheme="minorBidi" w:hAnsiTheme="minorBidi"/>
+              <w:pStyle w:val="p1"/>
+              <w:rPr>
+                <w:rFonts w:ascii="Arial" w:hAnsi="Arial" w:cs="Arial"/>
                 <w:sz w:val="20"/>
                 <w:szCs w:val="20"/>
               </w:rPr>
             </w:pPr>
+            <w:r>
+              <w:rPr>
+                <w:rFonts w:ascii="Arial" w:hAnsi="Arial" w:cs="Arial"/>
+                <w:sz w:val="20"/>
+                <w:szCs w:val="20"/>
+              </w:rPr>
+              <w:t>This supports availability because the organisation can recover more effectively after data loss, corruption or service failure.</w:t>
+            </w:r>
           </w:p>
         </w:tc>
       </w:tr>
@@ -4608,12 +5079,21 @@
           </w:tcPr>
           <w:p>
             <w:pPr>
-              <w:rPr>
-                <w:rFonts w:asciiTheme="minorBidi" w:hAnsiTheme="minorBidi"/>
+              <w:pStyle w:val="p1"/>
+              <w:rPr>
+                <w:rFonts w:ascii="Arial" w:hAnsi="Arial" w:cs="Arial"/>
                 <w:sz w:val="20"/>
                 <w:szCs w:val="20"/>
               </w:rPr>
             </w:pPr>
+            <w:r>
+              <w:rPr>
+                <w:rFonts w:ascii="Arial" w:hAnsi="Arial" w:cs="Arial"/>
+                <w:sz w:val="20"/>
+                <w:szCs w:val="20"/>
+              </w:rPr>
+              <w:t>Enable logging and monitoring for key services and administration activity</w:t>
+            </w:r>
           </w:p>
         </w:tc>
         <w:tc>
@@ -4628,12 +5108,21 @@
           </w:tcPr>
           <w:p>
             <w:pPr>
-              <w:rPr>
-                <w:rFonts w:asciiTheme="minorBidi" w:hAnsiTheme="minorBidi"/>
+              <w:pStyle w:val="p1"/>
+              <w:rPr>
+                <w:rFonts w:ascii="Arial" w:hAnsi="Arial" w:cs="Arial"/>
                 <w:sz w:val="20"/>
                 <w:szCs w:val="20"/>
               </w:rPr>
             </w:pPr>
+            <w:r>
+              <w:rPr>
+                <w:rFonts w:ascii="Arial" w:hAnsi="Arial" w:cs="Arial"/>
+                <w:sz w:val="20"/>
+                <w:szCs w:val="20"/>
+              </w:rPr>
+              <w:t>Logs help detect faults, investigate misuse, and provide evidence if inappropriate access or service problems occur.</w:t>
+            </w:r>
           </w:p>
         </w:tc>
       </w:tr>
@@ -4684,16 +5173,19 @@
     </w:p>
     <w:p>
       <w:pPr>
-        <w:spacing w:after="40" w:line="240" w:lineRule="auto"/>
-        <w:rPr>
-          <w:rFonts w:asciiTheme="minorBidi" w:hAnsiTheme="minorBidi"/>
-        </w:rPr>
-      </w:pPr>
-      <w:r>
-        <w:rPr>
-          <w:rFonts w:asciiTheme="minorBidi" w:hAnsiTheme="minorBidi"/>
-        </w:rPr>
-        <w:t>Answer: _______________________________________________________________________</w:t>
+        <w:pStyle w:val="p1"/>
+      </w:pPr>
+      <w:r>
+        <w:rPr>
+          <w:rFonts w:asciiTheme="minorBidi" w:hAnsiTheme="minorBidi"/>
+        </w:rPr>
+        <w:t xml:space="preserve">Answer: </w:t>
+      </w:r>
+      <w:r>
+        <w:rPr>
+          <w:rFonts w:ascii="Arial" w:hAnsi="Arial" w:cs="Arial"/>
+        </w:rPr>
+        <w:t>Yes. Each control is matched to the specific concern. For example, guest access is addressed through separation and filtering, while unprotected remote administration is addressed through SSH and better administrator account control.</w:t>
       </w:r>
     </w:p>
     <w:p>
@@ -4716,17 +5208,31 @@
     </w:p>
     <w:p>
       <w:pPr>
+        <w:pStyle w:val="p1"/>
+      </w:pPr>
+      <w:r>
+        <w:rPr>
+          <w:rFonts w:asciiTheme="minorBidi" w:hAnsiTheme="minorBidi"/>
+        </w:rPr>
+        <w:t>Answer:</w:t>
+      </w:r>
+      <w:r>
+        <w:t xml:space="preserve"> </w:t>
+      </w:r>
+      <w:r>
+        <w:rPr>
+          <w:rFonts w:ascii="Arial" w:hAnsi="Arial" w:cs="Arial"/>
+        </w:rPr>
+        <w:t>Yes. These are realistic baseline controls for a small enterprise because they use practical measures such as access separation, protected protocols, named accounts, backups, and logging.</w:t>
+      </w:r>
+    </w:p>
+    <w:p>
+      <w:pPr>
         <w:spacing w:after="40" w:line="240" w:lineRule="auto"/>
         <w:rPr>
           <w:rFonts w:asciiTheme="minorBidi" w:hAnsiTheme="minorBidi"/>
         </w:rPr>
       </w:pPr>
-      <w:r>
-        <w:rPr>
-          <w:rFonts w:asciiTheme="minorBidi" w:hAnsiTheme="minorBidi"/>
-        </w:rPr>
-        <w:t>Answer: _______________________________________________________________________</w:t>
-      </w:r>
     </w:p>
     <w:p>
       <w:pPr>
@@ -4748,17 +5254,32 @@
     </w:p>
     <w:p>
       <w:pPr>
+        <w:pStyle w:val="p1"/>
+      </w:pPr>
+      <w:r>
+        <w:rPr>
+          <w:rFonts w:asciiTheme="minorBidi" w:hAnsiTheme="minorBidi"/>
+        </w:rPr>
+        <w:lastRenderedPageBreak/>
+        <w:t>Answer:</w:t>
+      </w:r>
+      <w:r>
+        <w:t xml:space="preserve"> </w:t>
+      </w:r>
+      <w:r>
+        <w:rPr>
+          <w:rFonts w:ascii="Arial" w:hAnsi="Arial" w:cs="Arial"/>
+        </w:rPr>
+        <w:t>Yes. The controls reduce specific risks, but they do not prove that the whole network is fully secure. They should be supported with evidence such as diagrams, configuration screenshots, access tests, backup plans, and logging examples.</w:t>
+      </w:r>
+    </w:p>
+    <w:p>
+      <w:pPr>
         <w:spacing w:after="40" w:line="240" w:lineRule="auto"/>
         <w:rPr>
           <w:rFonts w:asciiTheme="minorBidi" w:hAnsiTheme="minorBidi"/>
         </w:rPr>
       </w:pPr>
-      <w:r>
-        <w:rPr>
-          <w:rFonts w:asciiTheme="minorBidi" w:hAnsiTheme="minorBidi"/>
-        </w:rPr>
-        <w:t>Answer: _______________________________________________________________________</w:t>
-      </w:r>
     </w:p>
     <w:p>
       <w:pPr>
@@ -5243,9 +5764,9 @@
         <w:tblLook w:val="04A0" w:firstRow="1" w:lastRow="0" w:firstColumn="1" w:lastColumn="0" w:noHBand="0" w:noVBand="1"/>
       </w:tblPr>
       <w:tblGrid>
-        <w:gridCol w:w="3094"/>
-        <w:gridCol w:w="3269"/>
-        <w:gridCol w:w="3265"/>
+        <w:gridCol w:w="2993"/>
+        <w:gridCol w:w="3437"/>
+        <w:gridCol w:w="3198"/>
       </w:tblGrid>
       <w:tr>
         <w:trPr>
@@ -5396,12 +5917,21 @@
           </w:tcPr>
           <w:p>
             <w:pPr>
-              <w:rPr>
-                <w:rFonts w:asciiTheme="minorBidi" w:hAnsiTheme="minorBidi"/>
+              <w:pStyle w:val="p1"/>
+              <w:rPr>
+                <w:rFonts w:ascii="Arial" w:hAnsi="Arial" w:cs="Arial"/>
                 <w:sz w:val="20"/>
                 <w:szCs w:val="20"/>
               </w:rPr>
             </w:pPr>
+            <w:r>
+              <w:rPr>
+                <w:rFonts w:ascii="Arial" w:hAnsi="Arial" w:cs="Arial"/>
+                <w:sz w:val="20"/>
+                <w:szCs w:val="20"/>
+              </w:rPr>
+              <w:t>A labelled network diagram showing separate guest and staff areas, an addressing/segmentation table, and Packet Tracer reachability tests showing that guest devices cannot reach the staff intranet while staff devices can.</w:t>
+            </w:r>
           </w:p>
         </w:tc>
         <w:tc>
@@ -5416,8 +5946,26 @@
           </w:tcPr>
           <w:p>
             <w:pPr>
-              <w:rPr>
-                <w:rFonts w:asciiTheme="minorBidi" w:hAnsiTheme="minorBidi"/>
+              <w:pStyle w:val="p1"/>
+              <w:rPr>
+                <w:rFonts w:ascii="Arial" w:hAnsi="Arial" w:cs="Arial"/>
+                <w:sz w:val="20"/>
+                <w:szCs w:val="20"/>
+              </w:rPr>
+            </w:pPr>
+            <w:r>
+              <w:rPr>
+                <w:rFonts w:ascii="Arial" w:hAnsi="Arial" w:cs="Arial"/>
+                <w:sz w:val="20"/>
+                <w:szCs w:val="20"/>
+              </w:rPr>
+              <w:t>It cannot prove that all attacks are prevented, or that all users are authorised correctly.</w:t>
+            </w:r>
+          </w:p>
+          <w:p>
+            <w:pPr>
+              <w:rPr>
+                <w:rFonts w:ascii="Arial" w:hAnsi="Arial" w:cs="Arial"/>
                 <w:sz w:val="20"/>
                 <w:szCs w:val="20"/>
               </w:rPr>
@@ -5469,12 +6017,21 @@
           </w:tcPr>
           <w:p>
             <w:pPr>
-              <w:rPr>
-                <w:rFonts w:asciiTheme="minorBidi" w:hAnsiTheme="minorBidi"/>
+              <w:pStyle w:val="p1"/>
+              <w:rPr>
+                <w:rFonts w:ascii="Arial" w:hAnsi="Arial" w:cs="Arial"/>
                 <w:sz w:val="20"/>
                 <w:szCs w:val="20"/>
               </w:rPr>
             </w:pPr>
+            <w:r>
+              <w:rPr>
+                <w:rFonts w:ascii="Arial" w:hAnsi="Arial" w:cs="Arial"/>
+                <w:sz w:val="20"/>
+                <w:szCs w:val="20"/>
+              </w:rPr>
+              <w:t>SSH configuration screenshot, successful SSH login/access test from the admin workstation, and evidence that insecure methods such as Telnet are disabled.</w:t>
+            </w:r>
           </w:p>
         </w:tc>
         <w:tc>
@@ -5487,6 +6044,115 @@
               <w:right w:w="70" w:type="dxa"/>
             </w:tcMar>
           </w:tcPr>
+          <w:p>
+            <w:pPr>
+              <w:pStyle w:val="p1"/>
+              <w:rPr>
+                <w:rFonts w:ascii="Arial" w:hAnsi="Arial" w:cs="Arial"/>
+                <w:sz w:val="20"/>
+                <w:szCs w:val="20"/>
+              </w:rPr>
+            </w:pPr>
+            <w:r>
+              <w:rPr>
+                <w:rFonts w:ascii="Arial" w:hAnsi="Arial" w:cs="Arial"/>
+                <w:sz w:val="20"/>
+                <w:szCs w:val="20"/>
+              </w:rPr>
+              <w:t>It cannot prove that every administrator account is secure, or that all management controls will be maintained correctly.</w:t>
+            </w:r>
+          </w:p>
+        </w:tc>
+      </w:tr>
+      <w:tr>
+        <w:trPr>
+          <w:jc w:val="center"/>
+        </w:trPr>
+        <w:tc>
+          <w:tcPr>
+            <w:tcW w:w="3456" w:type="dxa"/>
+            <w:tcMar>
+              <w:top w:w="60" w:type="dxa"/>
+              <w:left w:w="70" w:type="dxa"/>
+              <w:bottom w:w="60" w:type="dxa"/>
+              <w:right w:w="70" w:type="dxa"/>
+            </w:tcMar>
+          </w:tcPr>
+          <w:p>
+            <w:pPr>
+              <w:rPr>
+                <w:rFonts w:asciiTheme="minorBidi" w:hAnsiTheme="minorBidi"/>
+                <w:sz w:val="20"/>
+                <w:szCs w:val="20"/>
+              </w:rPr>
+            </w:pPr>
+            <w:r>
+              <w:rPr>
+                <w:rFonts w:asciiTheme="minorBidi" w:hAnsiTheme="minorBidi"/>
+                <w:sz w:val="20"/>
+                <w:szCs w:val="20"/>
+              </w:rPr>
+              <w:t>DNS/DHCP service availability is considered</w:t>
+            </w:r>
+          </w:p>
+        </w:tc>
+        <w:tc>
+          <w:tcPr>
+            <w:tcW w:w="3744" w:type="dxa"/>
+            <w:tcMar>
+              <w:top w:w="60" w:type="dxa"/>
+              <w:left w:w="70" w:type="dxa"/>
+              <w:bottom w:w="60" w:type="dxa"/>
+              <w:right w:w="70" w:type="dxa"/>
+            </w:tcMar>
+          </w:tcPr>
+          <w:p>
+            <w:pPr>
+              <w:pStyle w:val="p1"/>
+              <w:rPr>
+                <w:rFonts w:ascii="Arial" w:hAnsi="Arial" w:cs="Arial"/>
+                <w:sz w:val="20"/>
+                <w:szCs w:val="20"/>
+              </w:rPr>
+            </w:pPr>
+            <w:r>
+              <w:rPr>
+                <w:rFonts w:ascii="Arial" w:hAnsi="Arial" w:cs="Arial"/>
+                <w:sz w:val="20"/>
+                <w:szCs w:val="20"/>
+              </w:rPr>
+              <w:t>Client IP configuration showing DHCP has assigned correct settings, DNS lookup or service access test, and a short explanation of how DNS/DHCP support normal network access.</w:t>
+            </w:r>
+          </w:p>
+        </w:tc>
+        <w:tc>
+          <w:tcPr>
+            <w:tcW w:w="3744" w:type="dxa"/>
+            <w:tcMar>
+              <w:top w:w="60" w:type="dxa"/>
+              <w:left w:w="70" w:type="dxa"/>
+              <w:bottom w:w="60" w:type="dxa"/>
+              <w:right w:w="70" w:type="dxa"/>
+            </w:tcMar>
+          </w:tcPr>
+          <w:p>
+            <w:pPr>
+              <w:pStyle w:val="p1"/>
+              <w:rPr>
+                <w:rFonts w:ascii="Arial" w:hAnsi="Arial" w:cs="Arial"/>
+                <w:sz w:val="20"/>
+                <w:szCs w:val="20"/>
+              </w:rPr>
+            </w:pPr>
+            <w:r>
+              <w:rPr>
+                <w:rFonts w:ascii="Arial" w:hAnsi="Arial" w:cs="Arial"/>
+                <w:sz w:val="20"/>
+                <w:szCs w:val="20"/>
+              </w:rPr>
+              <w:t>It cannot prove that DNS/DHCP will always remain available during every failure or attack.</w:t>
+            </w:r>
+          </w:p>
           <w:p>
             <w:pPr>
               <w:rPr>
@@ -5526,7 +6192,7 @@
                 <w:sz w:val="20"/>
                 <w:szCs w:val="20"/>
               </w:rPr>
-              <w:t>DNS/DHCP service availability is considered</w:t>
+              <w:t>Backup or recovery has been considered</w:t>
             </w:r>
           </w:p>
         </w:tc>
@@ -5542,12 +6208,21 @@
           </w:tcPr>
           <w:p>
             <w:pPr>
-              <w:rPr>
-                <w:rFonts w:asciiTheme="minorBidi" w:hAnsiTheme="minorBidi"/>
+              <w:pStyle w:val="p1"/>
+              <w:rPr>
+                <w:rFonts w:ascii="Arial" w:hAnsi="Arial" w:cs="Arial"/>
                 <w:sz w:val="20"/>
                 <w:szCs w:val="20"/>
               </w:rPr>
             </w:pPr>
+            <w:r>
+              <w:rPr>
+                <w:rFonts w:ascii="Arial" w:hAnsi="Arial" w:cs="Arial"/>
+                <w:sz w:val="20"/>
+                <w:szCs w:val="20"/>
+              </w:rPr>
+              <w:t>A written backup/recovery plan, backup schedule, backup configuration screenshot, or evidence of a restore test.</w:t>
+            </w:r>
           </w:p>
         </w:tc>
         <w:tc>
@@ -5562,12 +6237,21 @@
           </w:tcPr>
           <w:p>
             <w:pPr>
-              <w:rPr>
-                <w:rFonts w:asciiTheme="minorBidi" w:hAnsiTheme="minorBidi"/>
+              <w:pStyle w:val="p1"/>
+              <w:rPr>
+                <w:rFonts w:ascii="Arial" w:hAnsi="Arial" w:cs="Arial"/>
                 <w:sz w:val="20"/>
                 <w:szCs w:val="20"/>
               </w:rPr>
             </w:pPr>
+            <w:r>
+              <w:rPr>
+                <w:rFonts w:ascii="Arial" w:hAnsi="Arial" w:cs="Arial"/>
+                <w:sz w:val="20"/>
+                <w:szCs w:val="20"/>
+              </w:rPr>
+              <w:t>It cannot prove that every future restore will succeed or that the whole system is fully resilient.</w:t>
+            </w:r>
           </w:p>
         </w:tc>
       </w:tr>
@@ -5599,79 +6283,6 @@
                 <w:sz w:val="20"/>
                 <w:szCs w:val="20"/>
               </w:rPr>
-              <w:t>Backup or recovery has been considered</w:t>
-            </w:r>
-          </w:p>
-        </w:tc>
-        <w:tc>
-          <w:tcPr>
-            <w:tcW w:w="3744" w:type="dxa"/>
-            <w:tcMar>
-              <w:top w:w="60" w:type="dxa"/>
-              <w:left w:w="70" w:type="dxa"/>
-              <w:bottom w:w="60" w:type="dxa"/>
-              <w:right w:w="70" w:type="dxa"/>
-            </w:tcMar>
-          </w:tcPr>
-          <w:p>
-            <w:pPr>
-              <w:rPr>
-                <w:rFonts w:asciiTheme="minorBidi" w:hAnsiTheme="minorBidi"/>
-                <w:sz w:val="20"/>
-                <w:szCs w:val="20"/>
-              </w:rPr>
-            </w:pPr>
-          </w:p>
-        </w:tc>
-        <w:tc>
-          <w:tcPr>
-            <w:tcW w:w="3744" w:type="dxa"/>
-            <w:tcMar>
-              <w:top w:w="60" w:type="dxa"/>
-              <w:left w:w="70" w:type="dxa"/>
-              <w:bottom w:w="60" w:type="dxa"/>
-              <w:right w:w="70" w:type="dxa"/>
-            </w:tcMar>
-          </w:tcPr>
-          <w:p>
-            <w:pPr>
-              <w:rPr>
-                <w:rFonts w:asciiTheme="minorBidi" w:hAnsiTheme="minorBidi"/>
-                <w:sz w:val="20"/>
-                <w:szCs w:val="20"/>
-              </w:rPr>
-            </w:pPr>
-          </w:p>
-        </w:tc>
-      </w:tr>
-      <w:tr>
-        <w:trPr>
-          <w:jc w:val="center"/>
-        </w:trPr>
-        <w:tc>
-          <w:tcPr>
-            <w:tcW w:w="3456" w:type="dxa"/>
-            <w:tcMar>
-              <w:top w:w="60" w:type="dxa"/>
-              <w:left w:w="70" w:type="dxa"/>
-              <w:bottom w:w="60" w:type="dxa"/>
-              <w:right w:w="70" w:type="dxa"/>
-            </w:tcMar>
-          </w:tcPr>
-          <w:p>
-            <w:pPr>
-              <w:rPr>
-                <w:rFonts w:asciiTheme="minorBidi" w:hAnsiTheme="minorBidi"/>
-                <w:sz w:val="20"/>
-                <w:szCs w:val="20"/>
-              </w:rPr>
-            </w:pPr>
-            <w:r>
-              <w:rPr>
-                <w:rFonts w:asciiTheme="minorBidi" w:hAnsiTheme="minorBidi"/>
-                <w:sz w:val="20"/>
-                <w:szCs w:val="20"/>
-              </w:rPr>
               <w:t>Monitoring or logging has been considered</w:t>
             </w:r>
           </w:p>
@@ -5688,6 +6299,33 @@
           </w:tcPr>
           <w:p>
             <w:pPr>
+              <w:pStyle w:val="p1"/>
+              <w:rPr>
+                <w:rFonts w:ascii="Arial" w:hAnsi="Arial" w:cs="Arial"/>
+                <w:sz w:val="20"/>
+                <w:szCs w:val="20"/>
+              </w:rPr>
+            </w:pPr>
+            <w:r>
+              <w:rPr>
+                <w:rFonts w:ascii="Arial" w:hAnsi="Arial" w:cs="Arial"/>
+                <w:sz w:val="20"/>
+                <w:szCs w:val="20"/>
+              </w:rPr>
+              <w:t xml:space="preserve">Logging or monitoring screenshot, sample log entries, or evidence that </w:t>
+            </w:r>
+            <w:r>
+              <w:rPr>
+                <w:rFonts w:ascii="Arial" w:hAnsi="Arial" w:cs="Arial"/>
+                <w:sz w:val="20"/>
+                <w:szCs w:val="20"/>
+              </w:rPr>
+              <w:lastRenderedPageBreak/>
+              <w:t>administration/service events are recorded.</w:t>
+            </w:r>
+          </w:p>
+          <w:p>
+            <w:pPr>
               <w:rPr>
                 <w:rFonts w:asciiTheme="minorBidi" w:hAnsiTheme="minorBidi"/>
                 <w:sz w:val="20"/>
@@ -5708,6 +6346,34 @@
           </w:tcPr>
           <w:p>
             <w:pPr>
+              <w:pStyle w:val="p1"/>
+              <w:rPr>
+                <w:rFonts w:ascii="Arial" w:hAnsi="Arial" w:cs="Arial"/>
+                <w:sz w:val="20"/>
+                <w:szCs w:val="20"/>
+              </w:rPr>
+            </w:pPr>
+            <w:r>
+              <w:rPr>
+                <w:rFonts w:ascii="Arial" w:hAnsi="Arial" w:cs="Arial"/>
+                <w:sz w:val="20"/>
+                <w:szCs w:val="20"/>
+              </w:rPr>
+              <w:lastRenderedPageBreak/>
+              <w:t xml:space="preserve">It cannot prove that every incident will be detected, or that logs will </w:t>
+            </w:r>
+            <w:r>
+              <w:rPr>
+                <w:rFonts w:ascii="Arial" w:hAnsi="Arial" w:cs="Arial"/>
+                <w:sz w:val="20"/>
+                <w:szCs w:val="20"/>
+              </w:rPr>
+              <w:lastRenderedPageBreak/>
+              <w:t>always be reviewed and maintained correctly.</w:t>
+            </w:r>
+          </w:p>
+          <w:p>
+            <w:pPr>
               <w:rPr>
                 <w:rFonts w:asciiTheme="minorBidi" w:hAnsiTheme="minorBidi"/>
                 <w:sz w:val="20"/>
@@ -5801,104 +6467,243 @@
     </w:p>
     <w:p>
       <w:pPr>
-        <w:spacing w:after="120" w:line="259" w:lineRule="auto"/>
-        <w:rPr>
-          <w:rFonts w:ascii="Arial" w:eastAsia="Arial" w:hAnsi="Arial"/>
-        </w:rPr>
-      </w:pPr>
-      <w:r>
-        <w:rPr>
-          <w:rFonts w:ascii="Arial" w:eastAsia="Arial" w:hAnsi="Arial"/>
-        </w:rPr>
-        <w:t>The main concern is ________________________________________________.</w:t>
+        <w:spacing w:before="240" w:after="0"/>
+        <w:rPr>
+          <w:rFonts w:asciiTheme="minorBidi" w:hAnsiTheme="minorBidi"/>
+          <w:b/>
+          <w:sz w:val="22"/>
+        </w:rPr>
+      </w:pPr>
+      <w:r>
+        <w:rPr>
+          <w:rFonts w:ascii="Arial" w:eastAsia="Arial" w:hAnsi="Arial" w:cs="Arial"/>
+          <w:szCs w:val="21"/>
+        </w:rPr>
+        <w:t xml:space="preserve">The main concern is </w:t>
+      </w:r>
+      <w:r>
+        <w:rPr>
+          <w:rFonts w:ascii="Arial" w:hAnsi="Arial" w:cs="Arial"/>
+          <w:szCs w:val="21"/>
+        </w:rPr>
+        <w:t>remote administration may be unprotected.</w:t>
       </w:r>
     </w:p>
     <w:p>
       <w:pPr>
-        <w:spacing w:after="120" w:line="259" w:lineRule="auto"/>
-        <w:rPr>
-          <w:rFonts w:ascii="Arial" w:eastAsia="Arial" w:hAnsi="Arial"/>
-        </w:rPr>
-      </w:pPr>
-      <w:r>
-        <w:rPr>
-          <w:rFonts w:ascii="Arial" w:eastAsia="Arial" w:hAnsi="Arial"/>
-        </w:rPr>
-        <w:t>This affects _________________________________ because _______________________________.</w:t>
+        <w:pStyle w:val="p1"/>
+        <w:rPr>
+          <w:rFonts w:ascii="Arial" w:hAnsi="Arial" w:cs="Arial"/>
+          <w:sz w:val="21"/>
+          <w:szCs w:val="21"/>
+        </w:rPr>
+      </w:pPr>
+      <w:r>
+        <w:rPr>
+          <w:rFonts w:ascii="Arial" w:eastAsia="Arial" w:hAnsi="Arial" w:cs="Arial"/>
+          <w:sz w:val="21"/>
+          <w:szCs w:val="21"/>
+        </w:rPr>
+        <w:t xml:space="preserve">This affects </w:t>
+      </w:r>
+      <w:r>
+        <w:rPr>
+          <w:rFonts w:ascii="Arial" w:hAnsi="Arial" w:cs="Arial"/>
+          <w:sz w:val="21"/>
+          <w:szCs w:val="21"/>
+        </w:rPr>
+        <w:t xml:space="preserve">confidentiality and </w:t>
+      </w:r>
+      <w:r>
+        <w:rPr>
+          <w:rFonts w:ascii="Arial" w:hAnsi="Arial" w:cs="Arial"/>
+          <w:sz w:val="21"/>
+          <w:szCs w:val="21"/>
+        </w:rPr>
+        <w:t>integrity</w:t>
+      </w:r>
+      <w:r>
+        <w:rPr>
+          <w:rStyle w:val="apple-converted-space"/>
+          <w:rFonts w:ascii="Arial" w:hAnsi="Arial" w:cs="Arial"/>
+          <w:sz w:val="21"/>
+          <w:szCs w:val="21"/>
+        </w:rPr>
+        <w:t xml:space="preserve"> because</w:t>
+      </w:r>
+      <w:r>
+        <w:rPr>
+          <w:rFonts w:ascii="Arial" w:eastAsia="Arial" w:hAnsi="Arial" w:cs="Arial"/>
+          <w:sz w:val="21"/>
+          <w:szCs w:val="21"/>
+        </w:rPr>
+        <w:t xml:space="preserve"> </w:t>
+      </w:r>
+      <w:r>
+        <w:rPr>
+          <w:rFonts w:ascii="Arial" w:hAnsi="Arial" w:cs="Arial"/>
+          <w:sz w:val="21"/>
+          <w:szCs w:val="21"/>
+        </w:rPr>
+        <w:t>remote administration may include administrator credentials, commands and configuration changes.</w:t>
       </w:r>
     </w:p>
     <w:p>
       <w:pPr>
-        <w:spacing w:after="120" w:line="259" w:lineRule="auto"/>
-        <w:rPr>
-          <w:rFonts w:ascii="Arial" w:eastAsia="Arial" w:hAnsi="Arial"/>
-        </w:rPr>
-      </w:pPr>
-      <w:r>
-        <w:rPr>
-          <w:rFonts w:ascii="Arial" w:eastAsia="Arial" w:hAnsi="Arial"/>
-        </w:rPr>
-        <w:t>The exposed condition is ________________________________________________.</w:t>
+        <w:pStyle w:val="p1"/>
+        <w:rPr>
+          <w:rFonts w:ascii="Arial" w:hAnsi="Arial" w:cs="Arial"/>
+          <w:sz w:val="21"/>
+          <w:szCs w:val="21"/>
+        </w:rPr>
+      </w:pPr>
+      <w:r>
+        <w:rPr>
+          <w:rFonts w:ascii="Arial" w:eastAsia="Arial" w:hAnsi="Arial" w:cs="Arial"/>
+          <w:sz w:val="21"/>
+          <w:szCs w:val="21"/>
+        </w:rPr>
+        <w:t>The exposed condition is</w:t>
+      </w:r>
+      <w:r>
+        <w:rPr>
+          <w:rFonts w:ascii="Arial" w:hAnsi="Arial" w:cs="Arial"/>
+          <w:sz w:val="21"/>
+          <w:szCs w:val="21"/>
+        </w:rPr>
+        <w:t xml:space="preserve"> </w:t>
+      </w:r>
+      <w:r>
+        <w:rPr>
+          <w:rFonts w:ascii="Arial" w:hAnsi="Arial" w:cs="Arial"/>
+          <w:sz w:val="21"/>
+          <w:szCs w:val="21"/>
+        </w:rPr>
+        <w:t>remote administration is available, but it is not clear whether the traffic is protected.</w:t>
       </w:r>
     </w:p>
     <w:p>
       <w:pPr>
-        <w:spacing w:after="120" w:line="259" w:lineRule="auto"/>
-        <w:rPr>
-          <w:rFonts w:ascii="Arial" w:eastAsia="Arial" w:hAnsi="Arial"/>
-        </w:rPr>
-      </w:pPr>
-      <w:r>
-        <w:rPr>
-          <w:rFonts w:ascii="Arial" w:eastAsia="Arial" w:hAnsi="Arial"/>
-        </w:rPr>
-        <w:t>A suitable baseline control is ________________________________________________.</w:t>
+        <w:pStyle w:val="p1"/>
+        <w:rPr>
+          <w:rFonts w:ascii="Arial" w:hAnsi="Arial" w:cs="Arial"/>
+          <w:sz w:val="21"/>
+          <w:szCs w:val="21"/>
+        </w:rPr>
+      </w:pPr>
+      <w:r>
+        <w:rPr>
+          <w:rFonts w:ascii="Arial" w:eastAsia="Arial" w:hAnsi="Arial" w:cs="Arial"/>
+          <w:sz w:val="21"/>
+          <w:szCs w:val="21"/>
+        </w:rPr>
+        <w:t xml:space="preserve">A suitable baseline control is </w:t>
+      </w:r>
+      <w:r>
+        <w:rPr>
+          <w:rFonts w:ascii="Arial" w:hAnsi="Arial" w:cs="Arial"/>
+          <w:sz w:val="21"/>
+          <w:szCs w:val="21"/>
+        </w:rPr>
+        <w:t>to use protected remote administration, such as SSH, with named administrator accounts and strong password rules.</w:t>
       </w:r>
     </w:p>
     <w:p>
       <w:pPr>
-        <w:spacing w:after="120" w:line="259" w:lineRule="auto"/>
-        <w:rPr>
-          <w:rFonts w:ascii="Arial" w:eastAsia="Arial" w:hAnsi="Arial"/>
-        </w:rPr>
-      </w:pPr>
-      <w:r>
-        <w:rPr>
-          <w:rFonts w:ascii="Arial" w:eastAsia="Arial" w:hAnsi="Arial"/>
-        </w:rPr>
-        <w:t>This control is appropriate because ________________________________________________.</w:t>
+        <w:pStyle w:val="p1"/>
+        <w:rPr>
+          <w:rFonts w:ascii="Arial" w:hAnsi="Arial" w:cs="Arial"/>
+          <w:sz w:val="21"/>
+          <w:szCs w:val="21"/>
+        </w:rPr>
+      </w:pPr>
+      <w:r>
+        <w:rPr>
+          <w:rFonts w:ascii="Arial" w:eastAsia="Arial" w:hAnsi="Arial" w:cs="Arial"/>
+          <w:sz w:val="21"/>
+          <w:szCs w:val="21"/>
+        </w:rPr>
+        <w:t xml:space="preserve">This control is appropriate because </w:t>
+      </w:r>
+      <w:r>
+        <w:rPr>
+          <w:rFonts w:ascii="Arial" w:hAnsi="Arial" w:cs="Arial"/>
+          <w:sz w:val="21"/>
+          <w:szCs w:val="21"/>
+        </w:rPr>
+        <w:t>it reduces the risk of credentials and management commands being exposed or misused.</w:t>
       </w:r>
     </w:p>
     <w:p>
       <w:pPr>
-        <w:spacing w:after="120" w:line="259" w:lineRule="auto"/>
-        <w:rPr>
-          <w:rFonts w:ascii="Arial" w:eastAsia="Arial" w:hAnsi="Arial"/>
-        </w:rPr>
-      </w:pPr>
-      <w:r>
-        <w:rPr>
-          <w:rFonts w:ascii="Arial" w:eastAsia="Arial" w:hAnsi="Arial"/>
-        </w:rPr>
-        <w:t>Evidence that could support this claim includes ____________________________________________.</w:t>
+        <w:pStyle w:val="p1"/>
+        <w:rPr>
+          <w:rFonts w:ascii="Arial" w:hAnsi="Arial" w:cs="Arial"/>
+          <w:sz w:val="21"/>
+          <w:szCs w:val="21"/>
+        </w:rPr>
+      </w:pPr>
+      <w:r>
+        <w:rPr>
+          <w:rFonts w:ascii="Arial" w:eastAsia="Arial" w:hAnsi="Arial" w:cs="Arial"/>
+          <w:sz w:val="21"/>
+          <w:szCs w:val="21"/>
+        </w:rPr>
+        <w:t>Evidence that could support this claim includes</w:t>
+      </w:r>
+      <w:r>
+        <w:rPr>
+          <w:rFonts w:ascii="Arial" w:hAnsi="Arial" w:cs="Arial"/>
+          <w:sz w:val="21"/>
+          <w:szCs w:val="21"/>
+        </w:rPr>
+        <w:t xml:space="preserve"> </w:t>
+      </w:r>
+      <w:r>
+        <w:rPr>
+          <w:rFonts w:ascii="Arial" w:hAnsi="Arial" w:cs="Arial"/>
+          <w:sz w:val="21"/>
+          <w:szCs w:val="21"/>
+        </w:rPr>
+        <w:t>an SSH configuration screenshot, a successful SSH access test from the admin workstation, and evidence that Telnet is disabled.</w:t>
       </w:r>
     </w:p>
     <w:p>
       <w:pPr>
-        <w:spacing w:after="120" w:line="259" w:lineRule="auto"/>
-        <w:rPr>
-          <w:rFonts w:ascii="Arial" w:eastAsia="Arial" w:hAnsi="Arial"/>
-        </w:rPr>
-      </w:pPr>
-      <w:r>
-        <w:rPr>
-          <w:rFonts w:ascii="Arial" w:eastAsia="Arial" w:hAnsi="Arial"/>
-        </w:rPr>
-        <w:t>A remaining limitation is ________________________________________________.</w:t>
+        <w:pStyle w:val="p1"/>
+        <w:rPr>
+          <w:rFonts w:ascii="Arial" w:hAnsi="Arial" w:cs="Arial"/>
+          <w:sz w:val="21"/>
+          <w:szCs w:val="21"/>
+        </w:rPr>
+      </w:pPr>
+      <w:r>
+        <w:rPr>
+          <w:rFonts w:ascii="Arial" w:eastAsia="Arial" w:hAnsi="Arial" w:cs="Arial"/>
+          <w:sz w:val="21"/>
+          <w:szCs w:val="21"/>
+        </w:rPr>
+        <w:t xml:space="preserve">A remaining limitation is </w:t>
+      </w:r>
+      <w:r>
+        <w:rPr>
+          <w:rFonts w:ascii="Arial" w:hAnsi="Arial" w:cs="Arial"/>
+          <w:sz w:val="21"/>
+          <w:szCs w:val="21"/>
+        </w:rPr>
+        <w:t>this evidence does not prove that every administrator account is secure or that the whole infrastructure is fully protected.</w:t>
       </w:r>
     </w:p>
     <w:p>
       <w:pPr>
+        <w:spacing w:after="120" w:line="259" w:lineRule="auto"/>
+        <w:rPr>
+          <w:rFonts w:ascii="Arial" w:eastAsia="Arial" w:hAnsi="Arial"/>
+        </w:rPr>
+      </w:pPr>
+    </w:p>
+    <w:p>
+      <w:pPr>
         <w:spacing w:before="240" w:after="0"/>
         <w:rPr>
           <w:rFonts w:asciiTheme="minorBidi" w:hAnsiTheme="minorBidi"/>
@@ -5949,132 +6754,58 @@
     </w:p>
     <w:p>
       <w:pPr>
-        <w:spacing w:after="40" w:line="240" w:lineRule="auto"/>
-        <w:rPr>
-          <w:rFonts w:asciiTheme="minorBidi" w:hAnsiTheme="minorBidi"/>
-        </w:rPr>
-      </w:pPr>
-      <w:r>
-        <w:rPr>
-          <w:rFonts w:asciiTheme="minorBidi" w:hAnsiTheme="minorBidi"/>
-        </w:rPr>
-        <w:t>_______________________</w:t>
-      </w:r>
-      <w:r>
-        <w:rPr>
-          <w:rFonts w:asciiTheme="minorBidi" w:hAnsiTheme="minorBidi"/>
-        </w:rPr>
-        <w:t>___________</w:t>
-      </w:r>
-      <w:r>
-        <w:rPr>
-          <w:rFonts w:asciiTheme="minorBidi" w:hAnsiTheme="minorBidi"/>
-        </w:rPr>
-        <w:t>________________________________________________</w:t>
-      </w:r>
-    </w:p>
-    <w:p>
-      <w:pPr>
-        <w:spacing w:after="40" w:line="240" w:lineRule="auto"/>
-        <w:rPr>
-          <w:rFonts w:asciiTheme="minorBidi" w:hAnsiTheme="minorBidi"/>
-        </w:rPr>
-      </w:pPr>
-      <w:r>
-        <w:rPr>
-          <w:rFonts w:asciiTheme="minorBidi" w:hAnsiTheme="minorBidi"/>
-        </w:rPr>
-        <w:t>_______________________</w:t>
-      </w:r>
-      <w:r>
-        <w:rPr>
-          <w:rFonts w:asciiTheme="minorBidi" w:hAnsiTheme="minorBidi"/>
-        </w:rPr>
-        <w:t>___________</w:t>
-      </w:r>
-      <w:r>
-        <w:rPr>
-          <w:rFonts w:asciiTheme="minorBidi" w:hAnsiTheme="minorBidi"/>
-        </w:rPr>
-        <w:t>________________________________________________</w:t>
-      </w:r>
-    </w:p>
-    <w:p>
-      <w:pPr>
-        <w:spacing w:after="40" w:line="240" w:lineRule="auto"/>
-        <w:rPr>
-          <w:rFonts w:asciiTheme="minorBidi" w:hAnsiTheme="minorBidi"/>
-        </w:rPr>
-      </w:pPr>
-      <w:r>
-        <w:rPr>
-          <w:rFonts w:asciiTheme="minorBidi" w:hAnsiTheme="minorBidi"/>
-        </w:rPr>
-        <w:t>_______________________</w:t>
-      </w:r>
-      <w:r>
-        <w:rPr>
-          <w:rFonts w:asciiTheme="minorBidi" w:hAnsiTheme="minorBidi"/>
-        </w:rPr>
-        <w:t>___________</w:t>
-      </w:r>
-      <w:r>
-        <w:rPr>
-          <w:rFonts w:asciiTheme="minorBidi" w:hAnsiTheme="minorBidi"/>
-        </w:rPr>
-        <w:t>________________________________________________</w:t>
-      </w:r>
-    </w:p>
-    <w:p>
-      <w:pPr>
-        <w:spacing w:after="40" w:line="240" w:lineRule="auto"/>
-        <w:rPr>
-          <w:rFonts w:asciiTheme="minorBidi" w:hAnsiTheme="minorBidi"/>
-        </w:rPr>
-      </w:pPr>
-      <w:r>
-        <w:rPr>
-          <w:rFonts w:asciiTheme="minorBidi" w:hAnsiTheme="minorBidi"/>
-        </w:rPr>
-        <w:t>_______________________</w:t>
-      </w:r>
-      <w:r>
-        <w:rPr>
-          <w:rFonts w:asciiTheme="minorBidi" w:hAnsiTheme="minorBidi"/>
-        </w:rPr>
-        <w:t>______________</w:t>
-      </w:r>
-      <w:r>
-        <w:rPr>
-          <w:rFonts w:asciiTheme="minorBidi" w:hAnsiTheme="minorBidi"/>
-        </w:rPr>
-        <w:t>_____________________________________________</w:t>
-      </w:r>
-    </w:p>
-    <w:p>
-      <w:pPr>
-        <w:spacing w:after="40" w:line="240" w:lineRule="auto"/>
-        <w:rPr>
-          <w:rFonts w:asciiTheme="minorBidi" w:hAnsiTheme="minorBidi"/>
-        </w:rPr>
-      </w:pPr>
-      <w:r>
-        <w:rPr>
-          <w:rFonts w:asciiTheme="minorBidi" w:hAnsiTheme="minorBidi"/>
-        </w:rPr>
-        <w:t>_______________________</w:t>
-      </w:r>
-      <w:r>
-        <w:rPr>
-          <w:rFonts w:asciiTheme="minorBidi" w:hAnsiTheme="minorBidi"/>
-        </w:rPr>
-        <w:t>___________</w:t>
-      </w:r>
-      <w:r>
-        <w:rPr>
-          <w:rFonts w:asciiTheme="minorBidi" w:hAnsiTheme="minorBidi"/>
-        </w:rPr>
-        <w:t>________________________________________________</w:t>
+        <w:pStyle w:val="p1"/>
+        <w:rPr>
+          <w:rFonts w:ascii="Arial" w:hAnsi="Arial" w:cs="Arial"/>
+          <w:sz w:val="21"/>
+          <w:szCs w:val="21"/>
+        </w:rPr>
+      </w:pPr>
+      <w:r>
+        <w:rPr>
+          <w:rFonts w:ascii="Arial" w:hAnsi="Arial" w:cs="Arial"/>
+          <w:sz w:val="21"/>
+          <w:szCs w:val="21"/>
+        </w:rPr>
+        <w:t xml:space="preserve">Remote administration should be treated as sensitive traffic because it may include administrator credentials, management commands and configuration changes. This affects </w:t>
+      </w:r>
+      <w:r>
+        <w:rPr>
+          <w:rStyle w:val="s1"/>
+          <w:rFonts w:ascii="Arial" w:hAnsi="Arial" w:cs="Arial"/>
+          <w:b/>
+          <w:bCs/>
+          <w:sz w:val="21"/>
+          <w:szCs w:val="21"/>
+        </w:rPr>
+        <w:t>confidentiality and integrity</w:t>
+      </w:r>
+      <w:r>
+        <w:rPr>
+          <w:rFonts w:ascii="Arial" w:hAnsi="Arial" w:cs="Arial"/>
+          <w:sz w:val="21"/>
+          <w:szCs w:val="21"/>
+        </w:rPr>
+        <w:t xml:space="preserve"> because exposed or misused administration access could allow an unauthorised person to view or change network device settings. The exposed condition is that remote administration is available, but the evidence does not clearly show whether the traffic is protected. A suitable baseline control is to use protected remote administration, such as </w:t>
+      </w:r>
+      <w:r>
+        <w:rPr>
+          <w:rStyle w:val="s1"/>
+          <w:rFonts w:ascii="Arial" w:hAnsi="Arial" w:cs="Arial"/>
+          <w:b/>
+          <w:bCs/>
+          <w:sz w:val="21"/>
+          <w:szCs w:val="21"/>
+        </w:rPr>
+        <w:t>SSH</w:t>
+      </w:r>
+      <w:r>
+        <w:rPr>
+          <w:rFonts w:ascii="Arial" w:hAnsi="Arial" w:cs="Arial"/>
+          <w:sz w:val="21"/>
+          <w:szCs w:val="21"/>
+        </w:rPr>
+        <w:t>, together with named administrator accounts and strong password rules. This control is appropriate because it reduces the risk of credentials and commands being exposed during management access. Evidence that could support this claim includes an SSH configuration screenshot, a successful SSH access test from the admin workstation, and evidence that insecure methods such as Telnet are disabled. A remaining limitation is that this evidence does not prove every administrator account is secure or that the whole infrastructure is fully protected.</w:t>
       </w:r>
     </w:p>
     <w:p>
@@ -6122,6 +6853,7 @@
         <w:rPr>
           <w:rFonts w:ascii="Arial" w:eastAsia="Arial" w:hAnsi="Arial"/>
         </w:rPr>
+        <w:lastRenderedPageBreak/>
         <w:t>Every improved statement should make clear what is being protected, what concern is being reduced, what control is being used, and what evidence or limitation should be considered where relevant.</w:t>
       </w:r>
     </w:p>
@@ -6133,8 +6865,8 @@
         <w:tblLook w:val="04A0" w:firstRow="1" w:lastRow="0" w:firstColumn="1" w:lastColumn="0" w:noHBand="0" w:noVBand="1"/>
       </w:tblPr>
       <w:tblGrid>
-        <w:gridCol w:w="3061"/>
-        <w:gridCol w:w="6567"/>
+        <w:gridCol w:w="3051"/>
+        <w:gridCol w:w="6577"/>
       </w:tblGrid>
       <w:tr>
         <w:trPr>
@@ -6252,12 +6984,21 @@
           </w:tcPr>
           <w:p>
             <w:pPr>
-              <w:rPr>
-                <w:rFonts w:asciiTheme="minorBidi" w:hAnsiTheme="minorBidi"/>
-                <w:sz w:val="20"/>
-                <w:szCs w:val="20"/>
+              <w:pStyle w:val="p1"/>
+              <w:rPr>
+                <w:rFonts w:ascii="Arial" w:hAnsi="Arial" w:cs="Arial"/>
+                <w:sz w:val="21"/>
+                <w:szCs w:val="21"/>
               </w:rPr>
             </w:pPr>
+            <w:r>
+              <w:rPr>
+                <w:rFonts w:ascii="Arial" w:hAnsi="Arial" w:cs="Arial"/>
+                <w:sz w:val="21"/>
+                <w:szCs w:val="21"/>
+              </w:rPr>
+              <w:t>The network design reduces specific risks by separating guest, staff and management access, but the evidence does not prove complete real-world security.</w:t>
+            </w:r>
           </w:p>
         </w:tc>
       </w:tr>
@@ -6305,12 +7046,21 @@
           </w:tcPr>
           <w:p>
             <w:pPr>
-              <w:rPr>
-                <w:rFonts w:asciiTheme="minorBidi" w:hAnsiTheme="minorBidi"/>
-                <w:sz w:val="20"/>
-                <w:szCs w:val="20"/>
+              <w:pStyle w:val="p1"/>
+              <w:rPr>
+                <w:rFonts w:ascii="Arial" w:hAnsi="Arial" w:cs="Arial"/>
+                <w:sz w:val="21"/>
+                <w:szCs w:val="21"/>
               </w:rPr>
             </w:pPr>
+            <w:r>
+              <w:rPr>
+                <w:rFonts w:ascii="Arial" w:hAnsi="Arial" w:cs="Arial"/>
+                <w:sz w:val="21"/>
+                <w:szCs w:val="21"/>
+              </w:rPr>
+              <w:t>Traffic filtering at the firewall/gateway boundary should restrict guest devices from reaching internal staff services while still allowing required access such as DNS, DHCP and internet access.</w:t>
+            </w:r>
           </w:p>
         </w:tc>
       </w:tr>
@@ -6358,12 +7108,21 @@
           </w:tcPr>
           <w:p>
             <w:pPr>
-              <w:rPr>
-                <w:rFonts w:asciiTheme="minorBidi" w:hAnsiTheme="minorBidi"/>
-                <w:sz w:val="20"/>
-                <w:szCs w:val="20"/>
+              <w:pStyle w:val="p1"/>
+              <w:rPr>
+                <w:rFonts w:ascii="Arial" w:hAnsi="Arial" w:cs="Arial"/>
+                <w:sz w:val="21"/>
+                <w:szCs w:val="21"/>
               </w:rPr>
             </w:pPr>
+            <w:r>
+              <w:rPr>
+                <w:rFonts w:ascii="Arial" w:hAnsi="Arial" w:cs="Arial"/>
+                <w:sz w:val="21"/>
+                <w:szCs w:val="21"/>
+              </w:rPr>
+              <w:t>SSH is suitable for remote administration because it protects management communication better than Telnet and reduces the risk of exposing credentials or commands.</w:t>
+            </w:r>
           </w:p>
         </w:tc>
       </w:tr>
@@ -6411,12 +7170,21 @@
           </w:tcPr>
           <w:p>
             <w:pPr>
-              <w:rPr>
-                <w:rFonts w:asciiTheme="minorBidi" w:hAnsiTheme="minorBidi"/>
-                <w:sz w:val="20"/>
-                <w:szCs w:val="20"/>
+              <w:pStyle w:val="p1"/>
+              <w:rPr>
+                <w:rFonts w:ascii="Arial" w:hAnsi="Arial" w:cs="Arial"/>
+                <w:sz w:val="21"/>
+                <w:szCs w:val="21"/>
               </w:rPr>
             </w:pPr>
+            <w:r>
+              <w:rPr>
+                <w:rFonts w:ascii="Arial" w:hAnsi="Arial" w:cs="Arial"/>
+                <w:sz w:val="21"/>
+                <w:szCs w:val="21"/>
+              </w:rPr>
+              <w:t>Backup and recovery planning supports availability by reducing the impact of data loss, corruption or service failure.</w:t>
+            </w:r>
           </w:p>
         </w:tc>
       </w:tr>
@@ -6464,12 +7232,21 @@
           </w:tcPr>
           <w:p>
             <w:pPr>
-              <w:rPr>
-                <w:rFonts w:asciiTheme="minorBidi" w:hAnsiTheme="minorBidi"/>
-                <w:sz w:val="20"/>
-                <w:szCs w:val="20"/>
+              <w:pStyle w:val="p1"/>
+              <w:rPr>
+                <w:rFonts w:ascii="Arial" w:hAnsi="Arial" w:cs="Arial"/>
+                <w:sz w:val="21"/>
+                <w:szCs w:val="21"/>
               </w:rPr>
             </w:pPr>
+            <w:r>
+              <w:rPr>
+                <w:rFonts w:ascii="Arial" w:hAnsi="Arial" w:cs="Arial"/>
+                <w:sz w:val="21"/>
+                <w:szCs w:val="21"/>
+              </w:rPr>
+              <w:t>Guest users should be blocked from internal staff services, such as the staff intranet, while still being allowed legitimate guest access such as Wi-Fi, DNS, DHCP and internet access.</w:t>
+            </w:r>
           </w:p>
         </w:tc>
       </w:tr>
@@ -6561,16 +7338,27 @@
     </w:p>
     <w:p>
       <w:pPr>
-        <w:spacing w:after="40" w:line="240" w:lineRule="auto"/>
-        <w:rPr>
-          <w:rFonts w:asciiTheme="minorBidi" w:hAnsiTheme="minorBidi"/>
-        </w:rPr>
-      </w:pPr>
-      <w:r>
-        <w:rPr>
-          <w:rFonts w:asciiTheme="minorBidi" w:hAnsiTheme="minorBidi"/>
-        </w:rPr>
-        <w:t>Answer: _______________________________________________________________________</w:t>
+        <w:pStyle w:val="p1"/>
+        <w:rPr>
+          <w:sz w:val="21"/>
+          <w:szCs w:val="21"/>
+        </w:rPr>
+      </w:pPr>
+      <w:r>
+        <w:rPr>
+          <w:rFonts w:asciiTheme="minorBidi" w:hAnsiTheme="minorBidi"/>
+          <w:sz w:val="21"/>
+          <w:szCs w:val="21"/>
+        </w:rPr>
+        <w:t xml:space="preserve">Answer: </w:t>
+      </w:r>
+      <w:r>
+        <w:rPr>
+          <w:rFonts w:ascii="Arial" w:hAnsi="Arial" w:cs="Arial"/>
+          <w:sz w:val="21"/>
+          <w:szCs w:val="21"/>
+        </w:rPr>
+        <w:t>The easiest exposed condition to analyse was guest Wi-Fi reaching the staff intranet, because it clearly shows a weak access boundary between less-trusted guest users and internal staff services.</w:t>
       </w:r>
     </w:p>
     <w:p>
@@ -6593,16 +7381,27 @@
     </w:p>
     <w:p>
       <w:pPr>
-        <w:spacing w:after="40" w:line="240" w:lineRule="auto"/>
-        <w:rPr>
-          <w:rFonts w:asciiTheme="minorBidi" w:hAnsiTheme="minorBidi"/>
-        </w:rPr>
-      </w:pPr>
-      <w:r>
-        <w:rPr>
-          <w:rFonts w:asciiTheme="minorBidi" w:hAnsiTheme="minorBidi"/>
-        </w:rPr>
-        <w:t>Answer: _______________________________________________________________________</w:t>
+        <w:pStyle w:val="p1"/>
+        <w:rPr>
+          <w:sz w:val="20"/>
+          <w:szCs w:val="20"/>
+        </w:rPr>
+      </w:pPr>
+      <w:r>
+        <w:rPr>
+          <w:rFonts w:asciiTheme="minorBidi" w:hAnsiTheme="minorBidi"/>
+          <w:sz w:val="20"/>
+          <w:szCs w:val="20"/>
+        </w:rPr>
+        <w:t xml:space="preserve">Answer: </w:t>
+      </w:r>
+      <w:r>
+        <w:rPr>
+          <w:rFonts w:ascii="Arial" w:hAnsi="Arial" w:cs="Arial"/>
+          <w:sz w:val="20"/>
+          <w:szCs w:val="20"/>
+        </w:rPr>
+        <w:t>The hardest control to justify was monitoring and logging, because the evidence does not show what systems are being monitored, what events are logged, or how the logs would be reviewed.</w:t>
       </w:r>
     </w:p>
     <w:p>
@@ -6625,16 +7424,28 @@
     </w:p>
     <w:p>
       <w:pPr>
-        <w:spacing w:after="40" w:line="240" w:lineRule="auto"/>
-        <w:rPr>
-          <w:rFonts w:asciiTheme="minorBidi" w:hAnsiTheme="minorBidi"/>
-        </w:rPr>
-      </w:pPr>
-      <w:r>
-        <w:rPr>
-          <w:rFonts w:asciiTheme="minorBidi" w:hAnsiTheme="minorBidi"/>
-        </w:rPr>
-        <w:t>Answer: _______________________________________________________________________</w:t>
+        <w:pStyle w:val="p1"/>
+        <w:rPr>
+          <w:rFonts w:ascii="Arial" w:hAnsi="Arial" w:cs="Arial"/>
+          <w:sz w:val="21"/>
+          <w:szCs w:val="21"/>
+        </w:rPr>
+      </w:pPr>
+      <w:r>
+        <w:rPr>
+          <w:rFonts w:ascii="Arial" w:hAnsi="Arial" w:cs="Arial"/>
+          <w:sz w:val="21"/>
+          <w:szCs w:val="21"/>
+        </w:rPr>
+        <w:t xml:space="preserve">Answer: </w:t>
+      </w:r>
+      <w:r>
+        <w:rPr>
+          <w:rFonts w:ascii="Arial" w:hAnsi="Arial" w:cs="Arial"/>
+          <w:sz w:val="21"/>
+          <w:szCs w:val="21"/>
+        </w:rPr>
+        <w:t>The most useful evidence would be a labelled network diagram, an addressing or segmentation table, and Packet Tracer reachability tests showing which users and devices can or cannot access specific services.</w:t>
       </w:r>
     </w:p>
     <w:p>
@@ -6657,16 +7468,28 @@
     </w:p>
     <w:p>
       <w:pPr>
-        <w:spacing w:after="40" w:line="240" w:lineRule="auto"/>
-        <w:rPr>
-          <w:rFonts w:asciiTheme="minorBidi" w:hAnsiTheme="minorBidi"/>
-        </w:rPr>
-      </w:pPr>
-      <w:r>
-        <w:rPr>
-          <w:rFonts w:asciiTheme="minorBidi" w:hAnsiTheme="minorBidi"/>
-        </w:rPr>
-        <w:t>Answer: _______________________________________________________________________</w:t>
+        <w:pStyle w:val="p1"/>
+        <w:rPr>
+          <w:rFonts w:ascii="Arial" w:hAnsi="Arial" w:cs="Arial"/>
+          <w:sz w:val="21"/>
+          <w:szCs w:val="21"/>
+        </w:rPr>
+      </w:pPr>
+      <w:r>
+        <w:rPr>
+          <w:rFonts w:ascii="Arial" w:hAnsi="Arial" w:cs="Arial"/>
+          <w:sz w:val="21"/>
+          <w:szCs w:val="21"/>
+        </w:rPr>
+        <w:t xml:space="preserve">Answer: </w:t>
+      </w:r>
+      <w:r>
+        <w:rPr>
+          <w:rFonts w:ascii="Arial" w:hAnsi="Arial" w:cs="Arial"/>
+          <w:sz w:val="21"/>
+          <w:szCs w:val="21"/>
+        </w:rPr>
+        <w:t>I should avoid claiming that Packet Tracer evidence proves full real-world security, because it only supports the design logic and selected validation evidence.</w:t>
       </w:r>
     </w:p>
     <w:p>
@@ -6689,17 +7512,37 @@
     </w:p>
     <w:p>
       <w:pPr>
+        <w:pStyle w:val="p1"/>
+        <w:rPr>
+          <w:rFonts w:ascii="Arial" w:hAnsi="Arial" w:cs="Arial"/>
+          <w:sz w:val="21"/>
+          <w:szCs w:val="21"/>
+        </w:rPr>
+      </w:pPr>
+      <w:r>
+        <w:rPr>
+          <w:rFonts w:ascii="Arial" w:hAnsi="Arial" w:cs="Arial"/>
+          <w:sz w:val="21"/>
+          <w:szCs w:val="21"/>
+        </w:rPr>
+        <w:t xml:space="preserve">Answer: </w:t>
+      </w:r>
+      <w:r>
+        <w:rPr>
+          <w:rFonts w:ascii="Arial" w:hAnsi="Arial" w:cs="Arial"/>
+          <w:sz w:val="21"/>
+          <w:szCs w:val="21"/>
+        </w:rPr>
+        <w:t>One improvement I can make is to link each security control to a specific concern, such as unauthorised access, credential exposure, service disruption or data loss, instead of making general statements like “the network will be secure.”</w:t>
+      </w:r>
+    </w:p>
+    <w:p>
+      <w:pPr>
         <w:spacing w:after="40" w:line="240" w:lineRule="auto"/>
         <w:rPr>
           <w:rFonts w:asciiTheme="minorBidi" w:hAnsiTheme="minorBidi"/>
         </w:rPr>
       </w:pPr>
-      <w:r>
-        <w:rPr>
-          <w:rFonts w:asciiTheme="minorBidi" w:hAnsiTheme="minorBidi"/>
-        </w:rPr>
-        <w:t>Answer: _______________________________________________________________________</w:t>
-      </w:r>
     </w:p>
     <w:p>
       <w:pPr>
@@ -6896,7 +7739,29 @@
                 <w:sz w:val="20"/>
                 <w:szCs w:val="20"/>
               </w:rPr>
-              <w:t>[   ]</w:t>
+              <w:t>[</w:t>
+            </w:r>
+            <w:r>
+              <w:rPr>
+                <w:rStyle w:val="Emphasis"/>
+                <w:rFonts w:ascii="Segoe UI Symbol" w:hAnsi="Segoe UI Symbol" w:cs="Segoe UI Symbol"/>
+                <w:b/>
+                <w:bCs/>
+                <w:i w:val="0"/>
+                <w:iCs w:val="0"/>
+                <w:color w:val="767676"/>
+                <w:szCs w:val="21"/>
+                <w:shd w:val="clear" w:color="auto" w:fill="FFFFFF"/>
+              </w:rPr>
+              <w:t>✓</w:t>
+            </w:r>
+            <w:r>
+              <w:rPr>
+                <w:rFonts w:asciiTheme="minorBidi" w:hAnsiTheme="minorBidi"/>
+                <w:sz w:val="20"/>
+                <w:szCs w:val="20"/>
+              </w:rPr>
+              <w:t>]</w:t>
             </w:r>
           </w:p>
         </w:tc>
@@ -6958,7 +7823,29 @@
                 <w:sz w:val="20"/>
                 <w:szCs w:val="20"/>
               </w:rPr>
-              <w:t>[   ]</w:t>
+              <w:t>[</w:t>
+            </w:r>
+            <w:r>
+              <w:rPr>
+                <w:rStyle w:val="Emphasis"/>
+                <w:rFonts w:ascii="Segoe UI Symbol" w:hAnsi="Segoe UI Symbol" w:cs="Segoe UI Symbol"/>
+                <w:b/>
+                <w:bCs/>
+                <w:i w:val="0"/>
+                <w:iCs w:val="0"/>
+                <w:color w:val="767676"/>
+                <w:szCs w:val="21"/>
+                <w:shd w:val="clear" w:color="auto" w:fill="FFFFFF"/>
+              </w:rPr>
+              <w:t>✓</w:t>
+            </w:r>
+            <w:r>
+              <w:rPr>
+                <w:rFonts w:asciiTheme="minorBidi" w:hAnsiTheme="minorBidi"/>
+                <w:sz w:val="20"/>
+                <w:szCs w:val="20"/>
+              </w:rPr>
+              <w:t>]</w:t>
             </w:r>
           </w:p>
         </w:tc>
@@ -7020,7 +7907,29 @@
                 <w:sz w:val="20"/>
                 <w:szCs w:val="20"/>
               </w:rPr>
-              <w:t>[   ]</w:t>
+              <w:t>[</w:t>
+            </w:r>
+            <w:r>
+              <w:rPr>
+                <w:rStyle w:val="Emphasis"/>
+                <w:rFonts w:ascii="Segoe UI Symbol" w:hAnsi="Segoe UI Symbol" w:cs="Segoe UI Symbol"/>
+                <w:b/>
+                <w:bCs/>
+                <w:i w:val="0"/>
+                <w:iCs w:val="0"/>
+                <w:color w:val="767676"/>
+                <w:szCs w:val="21"/>
+                <w:shd w:val="clear" w:color="auto" w:fill="FFFFFF"/>
+              </w:rPr>
+              <w:t>✓</w:t>
+            </w:r>
+            <w:r>
+              <w:rPr>
+                <w:rFonts w:asciiTheme="minorBidi" w:hAnsiTheme="minorBidi"/>
+                <w:sz w:val="20"/>
+                <w:szCs w:val="20"/>
+              </w:rPr>
+              <w:t>]</w:t>
             </w:r>
           </w:p>
         </w:tc>
@@ -7082,7 +7991,29 @@
                 <w:sz w:val="20"/>
                 <w:szCs w:val="20"/>
               </w:rPr>
-              <w:t>[   ]</w:t>
+              <w:t>[</w:t>
+            </w:r>
+            <w:r>
+              <w:rPr>
+                <w:rStyle w:val="Emphasis"/>
+                <w:rFonts w:ascii="Segoe UI Symbol" w:hAnsi="Segoe UI Symbol" w:cs="Segoe UI Symbol"/>
+                <w:b/>
+                <w:bCs/>
+                <w:i w:val="0"/>
+                <w:iCs w:val="0"/>
+                <w:color w:val="767676"/>
+                <w:szCs w:val="21"/>
+                <w:shd w:val="clear" w:color="auto" w:fill="FFFFFF"/>
+              </w:rPr>
+              <w:t>✓</w:t>
+            </w:r>
+            <w:r>
+              <w:rPr>
+                <w:rFonts w:asciiTheme="minorBidi" w:hAnsiTheme="minorBidi"/>
+                <w:sz w:val="20"/>
+                <w:szCs w:val="20"/>
+              </w:rPr>
+              <w:t>]</w:t>
             </w:r>
           </w:p>
         </w:tc>
@@ -7144,7 +8075,29 @@
                 <w:sz w:val="20"/>
                 <w:szCs w:val="20"/>
               </w:rPr>
-              <w:t>[   ]</w:t>
+              <w:t>[</w:t>
+            </w:r>
+            <w:r>
+              <w:rPr>
+                <w:rStyle w:val="Emphasis"/>
+                <w:rFonts w:ascii="Segoe UI Symbol" w:hAnsi="Segoe UI Symbol" w:cs="Segoe UI Symbol"/>
+                <w:b/>
+                <w:bCs/>
+                <w:i w:val="0"/>
+                <w:iCs w:val="0"/>
+                <w:color w:val="767676"/>
+                <w:szCs w:val="21"/>
+                <w:shd w:val="clear" w:color="auto" w:fill="FFFFFF"/>
+              </w:rPr>
+              <w:t>✓</w:t>
+            </w:r>
+            <w:r>
+              <w:rPr>
+                <w:rFonts w:asciiTheme="minorBidi" w:hAnsiTheme="minorBidi"/>
+                <w:sz w:val="20"/>
+                <w:szCs w:val="20"/>
+              </w:rPr>
+              <w:t>]</w:t>
             </w:r>
           </w:p>
         </w:tc>
@@ -7206,7 +8159,29 @@
                 <w:sz w:val="20"/>
                 <w:szCs w:val="20"/>
               </w:rPr>
-              <w:t>[   ]</w:t>
+              <w:t>[</w:t>
+            </w:r>
+            <w:r>
+              <w:rPr>
+                <w:rStyle w:val="Emphasis"/>
+                <w:rFonts w:ascii="Segoe UI Symbol" w:hAnsi="Segoe UI Symbol" w:cs="Segoe UI Symbol"/>
+                <w:b/>
+                <w:bCs/>
+                <w:i w:val="0"/>
+                <w:iCs w:val="0"/>
+                <w:color w:val="767676"/>
+                <w:szCs w:val="21"/>
+                <w:shd w:val="clear" w:color="auto" w:fill="FFFFFF"/>
+              </w:rPr>
+              <w:t>✓</w:t>
+            </w:r>
+            <w:r>
+              <w:rPr>
+                <w:rFonts w:asciiTheme="minorBidi" w:hAnsiTheme="minorBidi"/>
+                <w:sz w:val="20"/>
+                <w:szCs w:val="20"/>
+              </w:rPr>
+              <w:t>]</w:t>
             </w:r>
           </w:p>
         </w:tc>
@@ -7268,7 +8243,29 @@
                 <w:sz w:val="20"/>
                 <w:szCs w:val="20"/>
               </w:rPr>
-              <w:t>[   ]</w:t>
+              <w:t>[</w:t>
+            </w:r>
+            <w:r>
+              <w:rPr>
+                <w:rStyle w:val="Emphasis"/>
+                <w:rFonts w:ascii="Segoe UI Symbol" w:hAnsi="Segoe UI Symbol" w:cs="Segoe UI Symbol"/>
+                <w:b/>
+                <w:bCs/>
+                <w:i w:val="0"/>
+                <w:iCs w:val="0"/>
+                <w:color w:val="767676"/>
+                <w:szCs w:val="21"/>
+                <w:shd w:val="clear" w:color="auto" w:fill="FFFFFF"/>
+              </w:rPr>
+              <w:t>✓</w:t>
+            </w:r>
+            <w:r>
+              <w:rPr>
+                <w:rFonts w:asciiTheme="minorBidi" w:hAnsiTheme="minorBidi"/>
+                <w:sz w:val="20"/>
+                <w:szCs w:val="20"/>
+              </w:rPr>
+              <w:t>]</w:t>
             </w:r>
           </w:p>
         </w:tc>
@@ -7330,7 +8327,29 @@
                 <w:sz w:val="20"/>
                 <w:szCs w:val="20"/>
               </w:rPr>
-              <w:t>[   ]</w:t>
+              <w:t>[</w:t>
+            </w:r>
+            <w:r>
+              <w:rPr>
+                <w:rStyle w:val="Emphasis"/>
+                <w:rFonts w:ascii="Segoe UI Symbol" w:hAnsi="Segoe UI Symbol" w:cs="Segoe UI Symbol"/>
+                <w:b/>
+                <w:bCs/>
+                <w:i w:val="0"/>
+                <w:iCs w:val="0"/>
+                <w:color w:val="767676"/>
+                <w:szCs w:val="21"/>
+                <w:shd w:val="clear" w:color="auto" w:fill="FFFFFF"/>
+              </w:rPr>
+              <w:t>✓</w:t>
+            </w:r>
+            <w:r>
+              <w:rPr>
+                <w:rFonts w:asciiTheme="minorBidi" w:hAnsiTheme="minorBidi"/>
+                <w:sz w:val="20"/>
+                <w:szCs w:val="20"/>
+              </w:rPr>
+              <w:t>]</w:t>
             </w:r>
           </w:p>
         </w:tc>
@@ -7652,6 +8671,7 @@
         <w:rPr>
           <w:rFonts w:ascii="Arial" w:eastAsia="Arial" w:hAnsi="Arial"/>
         </w:rPr>
+        <w:lastRenderedPageBreak/>
         <w:t xml:space="preserve">Next week is Consolidation Week, </w:t>
       </w:r>
       <w:r>
@@ -7674,7 +8694,7 @@
 </file>
 
 <file path=word/endnotes.xml><?xml version="1.0" encoding="utf-8"?>
-<w:endnotes xmlns:wpc="http://schemas.microsoft.com/office/word/2010/wordprocessingCanvas" xmlns:cx="http://schemas.microsoft.com/office/drawing/2014/chartex" xmlns:cx1="http://schemas.microsoft.com/office/drawing/2015/9/8/chartex" xmlns:cx2="http://schemas.microsoft.com/office/drawing/2015/10/21/chartex" xmlns:cx3="http://schemas.microsoft.com/office/drawing/2016/5/9/chartex" xmlns:cx4="http://schemas.microsoft.com/office/drawing/2016/5/10/chartex" xmlns:cx5="http://schemas.microsoft.com/office/drawing/2016/5/11/chartex" xmlns:cx6="http://schemas.microsoft.com/office/drawing/2016/5/12/chartex" xmlns:cx7="http://schemas.microsoft.com/office/drawing/2016/5/13/chartex" xmlns:cx8="http://schemas.microsoft.com/office/drawing/2016/5/14/chartex" xmlns:mc="http://schemas.openxmlformats.org/markup-compatibility/2006" xmlns:aink="http://schemas.microsoft.com/office/drawing/2016/ink" xmlns:am3d="http://schemas.microsoft.com/office/drawing/2017/model3d" xmlns:o="urn:schemas-microsoft-com:office:office" xmlns:oel="http://schemas.microsoft.com/office/2019/extlst" xmlns:r="http://schemas.openxmlformats.org/officeDocument/2006/relationships" xmlns:m="http://schemas.openxmlformats.org/officeDocument/2006/math" xmlns:v="urn:schemas-microsoft-com:vml" xmlns:wp14="http://schemas.microsoft.com/office/word/2010/wordprocessingDrawing" xmlns:wp="http://schemas.openxmlformats.org/drawingml/2006/wordprocessingDrawing" xmlns:w10="urn:schemas-microsoft-com:office:word" xmlns:w="http://schemas.openxmlformats.org/wordprocessingml/2006/main" xmlns:w14="http://schemas.microsoft.com/office/word/2010/wordml" xmlns:w15="http://schemas.microsoft.com/office/word/2012/wordml" xmlns:w16cex="http://schemas.microsoft.com/office/word/2018/wordml/cex" xmlns:w16cid="http://schemas.microsoft.com/office/word/2016/wordml/cid" xmlns:w16="http://schemas.microsoft.com/office/word/2018/wordml" xmlns:w16du="http://schemas.microsoft.com/office/word/2023/wordml/word16du" xmlns:w16sdtdh="http://schemas.microsoft.com/office/word/2020/wordml/sdtdatahash" xmlns:w16sdtfl="http://schemas.microsoft.com/office/word/2024/wordml/sdtformatlock" xmlns:w16se="http://schemas.microsoft.com/office/word/2015/wordml/symex" xmlns:wpg="http://schemas.microsoft.com/office/word/2010/wordprocessingGroup" xmlns:wpi="http://schemas.microsoft.com/office/word/2010/wordprocessingInk" xmlns:wne="http://schemas.microsoft.com/office/word/2006/wordml" xmlns:wps="http://schemas.microsoft.com/office/word/2010/wordprocessingShape" mc:Ignorable="w14 w15 w16se w16cid w16 w16cex w16sdtdh w16sdtfl w16du wp14">
+<w:endnotes xmlns:wpc="http://schemas.microsoft.com/office/word/2010/wordprocessingCanvas" xmlns:cx="http://schemas.microsoft.com/office/drawing/2014/chartex" xmlns:cx1="http://schemas.microsoft.com/office/drawing/2015/9/8/chartex" xmlns:cx2="http://schemas.microsoft.com/office/drawing/2015/10/21/chartex" xmlns:cx3="http://schemas.microsoft.com/office/drawing/2016/5/9/chartex" xmlns:cx4="http://schemas.microsoft.com/office/drawing/2016/5/10/chartex" xmlns:cx5="http://schemas.microsoft.com/office/drawing/2016/5/11/chartex" xmlns:cx6="http://schemas.microsoft.com/office/drawing/2016/5/12/chartex" xmlns:cx7="http://schemas.microsoft.com/office/drawing/2016/5/13/chartex" xmlns:cx8="http://schemas.microsoft.com/office/drawing/2016/5/14/chartex" xmlns:mc="http://schemas.openxmlformats.org/markup-compatibility/2006" xmlns:m="http://schemas.openxmlformats.org/officeDocument/2006/math" xmlns:aink="http://schemas.microsoft.com/office/drawing/2016/ink" xmlns:am3d="http://schemas.microsoft.com/office/drawing/2017/model3d" xmlns:oel="http://schemas.microsoft.com/office/2019/extlst" xmlns:r="http://schemas.openxmlformats.org/officeDocument/2006/relationships" xmlns:wp14="http://schemas.microsoft.com/office/word/2010/wordprocessingDrawing" xmlns:wp="http://schemas.openxmlformats.org/drawingml/2006/wordprocessingDrawing" xmlns:wpg="http://schemas.microsoft.com/office/word/2010/wordprocessingGroup" xmlns:wpi="http://schemas.microsoft.com/office/word/2010/wordprocessingInk" xmlns:wps="http://schemas.microsoft.com/office/word/2010/wordprocessingShape" xmlns:o="urn:schemas-microsoft-com:office:office" xmlns:v="urn:schemas-microsoft-com:vml" xmlns:w10="urn:schemas-microsoft-com:office:word" xmlns:w="http://schemas.openxmlformats.org/wordprocessingml/2006/main" xmlns:w14="http://schemas.microsoft.com/office/word/2010/wordml" xmlns:w15="http://schemas.microsoft.com/office/word/2012/wordml" xmlns:w16cex="http://schemas.microsoft.com/office/word/2018/wordml/cex" xmlns:w16cid="http://schemas.microsoft.com/office/word/2016/wordml/cid" xmlns:w16="http://schemas.microsoft.com/office/word/2018/wordml" xmlns:w16sdtdh="http://schemas.microsoft.com/office/word/2020/wordml/sdtdatahash" xmlns:w16sdtfl="http://schemas.microsoft.com/office/word/2024/wordml/sdtformatlock" xmlns:w16se="http://schemas.microsoft.com/office/word/2015/wordml/symex" xmlns:w16du="http://schemas.microsoft.com/office/word/2023/wordml/word16du" xmlns:wne="http://schemas.microsoft.com/office/word/2006/wordml" mc:Ignorable="w14 w15 w16se w16cid w16 w16cex w16sdtdh w16sdtfl w16du wp14">
   <w:endnote w:type="separator" w:id="-1">
     <w:p>
       <w:pPr>
@@ -7699,7 +8719,7 @@
 </file>
 
 <file path=word/footer1.xml><?xml version="1.0" encoding="utf-8"?>
-<w:ftr xmlns:wpc="http://schemas.microsoft.com/office/word/2010/wordprocessingCanvas" xmlns:cx="http://schemas.microsoft.com/office/drawing/2014/chartex" xmlns:cx1="http://schemas.microsoft.com/office/drawing/2015/9/8/chartex" xmlns:cx2="http://schemas.microsoft.com/office/drawing/2015/10/21/chartex" xmlns:cx3="http://schemas.microsoft.com/office/drawing/2016/5/9/chartex" xmlns:cx4="http://schemas.microsoft.com/office/drawing/2016/5/10/chartex" xmlns:cx5="http://schemas.microsoft.com/office/drawing/2016/5/11/chartex" xmlns:cx6="http://schemas.microsoft.com/office/drawing/2016/5/12/chartex" xmlns:cx7="http://schemas.microsoft.com/office/drawing/2016/5/13/chartex" xmlns:cx8="http://schemas.microsoft.com/office/drawing/2016/5/14/chartex" xmlns:mc="http://schemas.openxmlformats.org/markup-compatibility/2006" xmlns:aink="http://schemas.microsoft.com/office/drawing/2016/ink" xmlns:am3d="http://schemas.microsoft.com/office/drawing/2017/model3d" xmlns:o="urn:schemas-microsoft-com:office:office" xmlns:oel="http://schemas.microsoft.com/office/2019/extlst" xmlns:r="http://schemas.openxmlformats.org/officeDocument/2006/relationships" xmlns:m="http://schemas.openxmlformats.org/officeDocument/2006/math" xmlns:v="urn:schemas-microsoft-com:vml" xmlns:wp14="http://schemas.microsoft.com/office/word/2010/wordprocessingDrawing" xmlns:wp="http://schemas.openxmlformats.org/drawingml/2006/wordprocessingDrawing" xmlns:w10="urn:schemas-microsoft-com:office:word" xmlns:w="http://schemas.openxmlformats.org/wordprocessingml/2006/main" xmlns:w14="http://schemas.microsoft.com/office/word/2010/wordml" xmlns:w15="http://schemas.microsoft.com/office/word/2012/wordml" xmlns:w16cex="http://schemas.microsoft.com/office/word/2018/wordml/cex" xmlns:w16cid="http://schemas.microsoft.com/office/word/2016/wordml/cid" xmlns:w16="http://schemas.microsoft.com/office/word/2018/wordml" xmlns:w16du="http://schemas.microsoft.com/office/word/2023/wordml/word16du" xmlns:w16sdtdh="http://schemas.microsoft.com/office/word/2020/wordml/sdtdatahash" xmlns:w16sdtfl="http://schemas.microsoft.com/office/word/2024/wordml/sdtformatlock" xmlns:w16se="http://schemas.microsoft.com/office/word/2015/wordml/symex" xmlns:wpg="http://schemas.microsoft.com/office/word/2010/wordprocessingGroup" xmlns:wpi="http://schemas.microsoft.com/office/word/2010/wordprocessingInk" xmlns:wne="http://schemas.microsoft.com/office/word/2006/wordml" xmlns:wps="http://schemas.microsoft.com/office/word/2010/wordprocessingShape" mc:Ignorable="w14 w15 w16se w16cid w16 w16cex w16sdtdh w16sdtfl w16du wp14">
+<w:ftr xmlns:wpc="http://schemas.microsoft.com/office/word/2010/wordprocessingCanvas" xmlns:cx="http://schemas.microsoft.com/office/drawing/2014/chartex" xmlns:cx1="http://schemas.microsoft.com/office/drawing/2015/9/8/chartex" xmlns:cx2="http://schemas.microsoft.com/office/drawing/2015/10/21/chartex" xmlns:cx3="http://schemas.microsoft.com/office/drawing/2016/5/9/chartex" xmlns:cx4="http://schemas.microsoft.com/office/drawing/2016/5/10/chartex" xmlns:cx5="http://schemas.microsoft.com/office/drawing/2016/5/11/chartex" xmlns:cx6="http://schemas.microsoft.com/office/drawing/2016/5/12/chartex" xmlns:cx7="http://schemas.microsoft.com/office/drawing/2016/5/13/chartex" xmlns:cx8="http://schemas.microsoft.com/office/drawing/2016/5/14/chartex" xmlns:mc="http://schemas.openxmlformats.org/markup-compatibility/2006" xmlns:m="http://schemas.openxmlformats.org/officeDocument/2006/math" xmlns:aink="http://schemas.microsoft.com/office/drawing/2016/ink" xmlns:am3d="http://schemas.microsoft.com/office/drawing/2017/model3d" xmlns:oel="http://schemas.microsoft.com/office/2019/extlst" xmlns:r="http://schemas.openxmlformats.org/officeDocument/2006/relationships" xmlns:wp14="http://schemas.microsoft.com/office/word/2010/wordprocessingDrawing" xmlns:wp="http://schemas.openxmlformats.org/drawingml/2006/wordprocessingDrawing" xmlns:wpg="http://schemas.microsoft.com/office/word/2010/wordprocessingGroup" xmlns:wpi="http://schemas.microsoft.com/office/word/2010/wordprocessingInk" xmlns:wps="http://schemas.microsoft.com/office/word/2010/wordprocessingShape" xmlns:o="urn:schemas-microsoft-com:office:office" xmlns:v="urn:schemas-microsoft-com:vml" xmlns:w10="urn:schemas-microsoft-com:office:word" xmlns:w="http://schemas.openxmlformats.org/wordprocessingml/2006/main" xmlns:w14="http://schemas.microsoft.com/office/word/2010/wordml" xmlns:w15="http://schemas.microsoft.com/office/word/2012/wordml" xmlns:w16cex="http://schemas.microsoft.com/office/word/2018/wordml/cex" xmlns:w16cid="http://schemas.microsoft.com/office/word/2016/wordml/cid" xmlns:w16="http://schemas.microsoft.com/office/word/2018/wordml" xmlns:w16sdtdh="http://schemas.microsoft.com/office/word/2020/wordml/sdtdatahash" xmlns:w16sdtfl="http://schemas.microsoft.com/office/word/2024/wordml/sdtformatlock" xmlns:w16se="http://schemas.microsoft.com/office/word/2015/wordml/symex" xmlns:w16du="http://schemas.microsoft.com/office/word/2023/wordml/word16du" xmlns:wne="http://schemas.microsoft.com/office/word/2006/wordml" mc:Ignorable="w14 w15 w16se w16cid w16 w16cex w16sdtdh w16sdtfl w16du wp14">
   <w:sdt>
     <w:sdtPr>
       <w:rPr>
@@ -7762,7 +8782,7 @@
 </file>
 
 <file path=word/footnotes.xml><?xml version="1.0" encoding="utf-8"?>
-<w:footnotes xmlns:wpc="http://schemas.microsoft.com/office/word/2010/wordprocessingCanvas" xmlns:cx="http://schemas.microsoft.com/office/drawing/2014/chartex" xmlns:cx1="http://schemas.microsoft.com/office/drawing/2015/9/8/chartex" xmlns:cx2="http://schemas.microsoft.com/office/drawing/2015/10/21/chartex" xmlns:cx3="http://schemas.microsoft.com/office/drawing/2016/5/9/chartex" xmlns:cx4="http://schemas.microsoft.com/office/drawing/2016/5/10/chartex" xmlns:cx5="http://schemas.microsoft.com/office/drawing/2016/5/11/chartex" xmlns:cx6="http://schemas.microsoft.com/office/drawing/2016/5/12/chartex" xmlns:cx7="http://schemas.microsoft.com/office/drawing/2016/5/13/chartex" xmlns:cx8="http://schemas.microsoft.com/office/drawing/2016/5/14/chartex" xmlns:mc="http://schemas.openxmlformats.org/markup-compatibility/2006" xmlns:aink="http://schemas.microsoft.com/office/drawing/2016/ink" xmlns:am3d="http://schemas.microsoft.com/office/drawing/2017/model3d" xmlns:o="urn:schemas-microsoft-com:office:office" xmlns:oel="http://schemas.microsoft.com/office/2019/extlst" xmlns:r="http://schemas.openxmlformats.org/officeDocument/2006/relationships" xmlns:m="http://schemas.openxmlformats.org/officeDocument/2006/math" xmlns:v="urn:schemas-microsoft-com:vml" xmlns:wp14="http://schemas.microsoft.com/office/word/2010/wordprocessingDrawing" xmlns:wp="http://schemas.openxmlformats.org/drawingml/2006/wordprocessingDrawing" xmlns:w10="urn:schemas-microsoft-com:office:word" xmlns:w="http://schemas.openxmlformats.org/wordprocessingml/2006/main" xmlns:w14="http://schemas.microsoft.com/office/word/2010/wordml" xmlns:w15="http://schemas.microsoft.com/office/word/2012/wordml" xmlns:w16cex="http://schemas.microsoft.com/office/word/2018/wordml/cex" xmlns:w16cid="http://schemas.microsoft.com/office/word/2016/wordml/cid" xmlns:w16="http://schemas.microsoft.com/office/word/2018/wordml" xmlns:w16du="http://schemas.microsoft.com/office/word/2023/wordml/word16du" xmlns:w16sdtdh="http://schemas.microsoft.com/office/word/2020/wordml/sdtdatahash" xmlns:w16sdtfl="http://schemas.microsoft.com/office/word/2024/wordml/sdtformatlock" xmlns:w16se="http://schemas.microsoft.com/office/word/2015/wordml/symex" xmlns:wpg="http://schemas.microsoft.com/office/word/2010/wordprocessingGroup" xmlns:wpi="http://schemas.microsoft.com/office/word/2010/wordprocessingInk" xmlns:wne="http://schemas.microsoft.com/office/word/2006/wordml" xmlns:wps="http://schemas.microsoft.com/office/word/2010/wordprocessingShape" mc:Ignorable="w14 w15 w16se w16cid w16 w16cex w16sdtdh w16sdtfl w16du wp14">
+<w:footnotes xmlns:wpc="http://schemas.microsoft.com/office/word/2010/wordprocessingCanvas" xmlns:cx="http://schemas.microsoft.com/office/drawing/2014/chartex" xmlns:cx1="http://schemas.microsoft.com/office/drawing/2015/9/8/chartex" xmlns:cx2="http://schemas.microsoft.com/office/drawing/2015/10/21/chartex" xmlns:cx3="http://schemas.microsoft.com/office/drawing/2016/5/9/chartex" xmlns:cx4="http://schemas.microsoft.com/office/drawing/2016/5/10/chartex" xmlns:cx5="http://schemas.microsoft.com/office/drawing/2016/5/11/chartex" xmlns:cx6="http://schemas.microsoft.com/office/drawing/2016/5/12/chartex" xmlns:cx7="http://schemas.microsoft.com/office/drawing/2016/5/13/chartex" xmlns:cx8="http://schemas.microsoft.com/office/drawing/2016/5/14/chartex" xmlns:mc="http://schemas.openxmlformats.org/markup-compatibility/2006" xmlns:m="http://schemas.openxmlformats.org/officeDocument/2006/math" xmlns:aink="http://schemas.microsoft.com/office/drawing/2016/ink" xmlns:am3d="http://schemas.microsoft.com/office/drawing/2017/model3d" xmlns:oel="http://schemas.microsoft.com/office/2019/extlst" xmlns:r="http://schemas.openxmlformats.org/officeDocument/2006/relationships" xmlns:wp14="http://schemas.microsoft.com/office/word/2010/wordprocessingDrawing" xmlns:wp="http://schemas.openxmlformats.org/drawingml/2006/wordprocessingDrawing" xmlns:wpg="http://schemas.microsoft.com/office/word/2010/wordprocessingGroup" xmlns:wpi="http://schemas.microsoft.com/office/word/2010/wordprocessingInk" xmlns:wps="http://schemas.microsoft.com/office/word/2010/wordprocessingShape" xmlns:o="urn:schemas-microsoft-com:office:office" xmlns:v="urn:schemas-microsoft-com:vml" xmlns:w10="urn:schemas-microsoft-com:office:word" xmlns:w="http://schemas.openxmlformats.org/wordprocessingml/2006/main" xmlns:w14="http://schemas.microsoft.com/office/word/2010/wordml" xmlns:w15="http://schemas.microsoft.com/office/word/2012/wordml" xmlns:w16cex="http://schemas.microsoft.com/office/word/2018/wordml/cex" xmlns:w16cid="http://schemas.microsoft.com/office/word/2016/wordml/cid" xmlns:w16="http://schemas.microsoft.com/office/word/2018/wordml" xmlns:w16sdtdh="http://schemas.microsoft.com/office/word/2020/wordml/sdtdatahash" xmlns:w16sdtfl="http://schemas.microsoft.com/office/word/2024/wordml/sdtformatlock" xmlns:w16se="http://schemas.microsoft.com/office/word/2015/wordml/symex" xmlns:w16du="http://schemas.microsoft.com/office/word/2023/wordml/word16du" xmlns:wne="http://schemas.microsoft.com/office/word/2006/wordml" mc:Ignorable="w14 w15 w16se w16cid w16 w16cex w16sdtdh w16sdtfl w16du wp14">
   <w:footnote w:type="separator" w:id="-1">
     <w:p>
       <w:pPr>
@@ -7787,7 +8807,7 @@
 </file>
 
 <file path=word/header1.xml><?xml version="1.0" encoding="utf-8"?>
-<w:hdr xmlns:wpc="http://schemas.microsoft.com/office/word/2010/wordprocessingCanvas" xmlns:cx="http://schemas.microsoft.com/office/drawing/2014/chartex" xmlns:cx1="http://schemas.microsoft.com/office/drawing/2015/9/8/chartex" xmlns:cx2="http://schemas.microsoft.com/office/drawing/2015/10/21/chartex" xmlns:cx3="http://schemas.microsoft.com/office/drawing/2016/5/9/chartex" xmlns:cx4="http://schemas.microsoft.com/office/drawing/2016/5/10/chartex" xmlns:cx5="http://schemas.microsoft.com/office/drawing/2016/5/11/chartex" xmlns:cx6="http://schemas.microsoft.com/office/drawing/2016/5/12/chartex" xmlns:cx7="http://schemas.microsoft.com/office/drawing/2016/5/13/chartex" xmlns:cx8="http://schemas.microsoft.com/office/drawing/2016/5/14/chartex" xmlns:mc="http://schemas.openxmlformats.org/markup-compatibility/2006" xmlns:aink="http://schemas.microsoft.com/office/drawing/2016/ink" xmlns:am3d="http://schemas.microsoft.com/office/drawing/2017/model3d" xmlns:o="urn:schemas-microsoft-com:office:office" xmlns:oel="http://schemas.microsoft.com/office/2019/extlst" xmlns:r="http://schemas.openxmlformats.org/officeDocument/2006/relationships" xmlns:m="http://schemas.openxmlformats.org/officeDocument/2006/math" xmlns:v="urn:schemas-microsoft-com:vml" xmlns:wp14="http://schemas.microsoft.com/office/word/2010/wordprocessingDrawing" xmlns:wp="http://schemas.openxmlformats.org/drawingml/2006/wordprocessingDrawing" xmlns:w10="urn:schemas-microsoft-com:office:word" xmlns:w="http://schemas.openxmlformats.org/wordprocessingml/2006/main" xmlns:w14="http://schemas.microsoft.com/office/word/2010/wordml" xmlns:w15="http://schemas.microsoft.com/office/word/2012/wordml" xmlns:w16cex="http://schemas.microsoft.com/office/word/2018/wordml/cex" xmlns:w16cid="http://schemas.microsoft.com/office/word/2016/wordml/cid" xmlns:w16="http://schemas.microsoft.com/office/word/2018/wordml" xmlns:w16du="http://schemas.microsoft.com/office/word/2023/wordml/word16du" xmlns:w16sdtdh="http://schemas.microsoft.com/office/word/2020/wordml/sdtdatahash" xmlns:w16sdtfl="http://schemas.microsoft.com/office/word/2024/wordml/sdtformatlock" xmlns:w16se="http://schemas.microsoft.com/office/word/2015/wordml/symex" xmlns:wpg="http://schemas.microsoft.com/office/word/2010/wordprocessingGroup" xmlns:wpi="http://schemas.microsoft.com/office/word/2010/wordprocessingInk" xmlns:wne="http://schemas.microsoft.com/office/word/2006/wordml" xmlns:wps="http://schemas.microsoft.com/office/word/2010/wordprocessingShape" mc:Ignorable="w14 w15 w16se w16cid w16 w16cex w16sdtdh w16sdtfl w16du wp14">
+<w:hdr xmlns:wpc="http://schemas.microsoft.com/office/word/2010/wordprocessingCanvas" xmlns:cx="http://schemas.microsoft.com/office/drawing/2014/chartex" xmlns:cx1="http://schemas.microsoft.com/office/drawing/2015/9/8/chartex" xmlns:cx2="http://schemas.microsoft.com/office/drawing/2015/10/21/chartex" xmlns:cx3="http://schemas.microsoft.com/office/drawing/2016/5/9/chartex" xmlns:cx4="http://schemas.microsoft.com/office/drawing/2016/5/10/chartex" xmlns:cx5="http://schemas.microsoft.com/office/drawing/2016/5/11/chartex" xmlns:cx6="http://schemas.microsoft.com/office/drawing/2016/5/12/chartex" xmlns:cx7="http://schemas.microsoft.com/office/drawing/2016/5/13/chartex" xmlns:cx8="http://schemas.microsoft.com/office/drawing/2016/5/14/chartex" xmlns:mc="http://schemas.openxmlformats.org/markup-compatibility/2006" xmlns:m="http://schemas.openxmlformats.org/officeDocument/2006/math" xmlns:aink="http://schemas.microsoft.com/office/drawing/2016/ink" xmlns:am3d="http://schemas.microsoft.com/office/drawing/2017/model3d" xmlns:oel="http://schemas.microsoft.com/office/2019/extlst" xmlns:r="http://schemas.openxmlformats.org/officeDocument/2006/relationships" xmlns:wp14="http://schemas.microsoft.com/office/word/2010/wordprocessingDrawing" xmlns:wp="http://schemas.openxmlformats.org/drawingml/2006/wordprocessingDrawing" xmlns:wpg="http://schemas.microsoft.com/office/word/2010/wordprocessingGroup" xmlns:wpi="http://schemas.microsoft.com/office/word/2010/wordprocessingInk" xmlns:wps="http://schemas.microsoft.com/office/word/2010/wordprocessingShape" xmlns:o="urn:schemas-microsoft-com:office:office" xmlns:v="urn:schemas-microsoft-com:vml" xmlns:w10="urn:schemas-microsoft-com:office:word" xmlns:w="http://schemas.openxmlformats.org/wordprocessingml/2006/main" xmlns:w14="http://schemas.microsoft.com/office/word/2010/wordml" xmlns:w15="http://schemas.microsoft.com/office/word/2012/wordml" xmlns:w16cex="http://schemas.microsoft.com/office/word/2018/wordml/cex" xmlns:w16cid="http://schemas.microsoft.com/office/word/2016/wordml/cid" xmlns:w16="http://schemas.microsoft.com/office/word/2018/wordml" xmlns:w16sdtdh="http://schemas.microsoft.com/office/word/2020/wordml/sdtdatahash" xmlns:w16sdtfl="http://schemas.microsoft.com/office/word/2024/wordml/sdtformatlock" xmlns:w16se="http://schemas.microsoft.com/office/word/2015/wordml/symex" xmlns:w16du="http://schemas.microsoft.com/office/word/2023/wordml/word16du" xmlns:wne="http://schemas.microsoft.com/office/word/2006/wordml" mc:Ignorable="w14 w15 w16se w16cid w16 w16cex w16sdtdh w16sdtfl w16du wp14">
   <w:p>
     <w:pPr>
       <w:pStyle w:val="Header"/>
@@ -7809,7 +8829,7 @@
 </file>
 
 <file path=word/numbering.xml><?xml version="1.0" encoding="utf-8"?>
-<w:numbering xmlns:wpc="http://schemas.microsoft.com/office/word/2010/wordprocessingCanvas" xmlns:cx="http://schemas.microsoft.com/office/drawing/2014/chartex" xmlns:cx1="http://schemas.microsoft.com/office/drawing/2015/9/8/chartex" xmlns:cx2="http://schemas.microsoft.com/office/drawing/2015/10/21/chartex" xmlns:cx3="http://schemas.microsoft.com/office/drawing/2016/5/9/chartex" xmlns:cx4="http://schemas.microsoft.com/office/drawing/2016/5/10/chartex" xmlns:cx5="http://schemas.microsoft.com/office/drawing/2016/5/11/chartex" xmlns:cx6="http://schemas.microsoft.com/office/drawing/2016/5/12/chartex" xmlns:cx7="http://schemas.microsoft.com/office/drawing/2016/5/13/chartex" xmlns:cx8="http://schemas.microsoft.com/office/drawing/2016/5/14/chartex" xmlns:mc="http://schemas.openxmlformats.org/markup-compatibility/2006" xmlns:aink="http://schemas.microsoft.com/office/drawing/2016/ink" xmlns:am3d="http://schemas.microsoft.com/office/drawing/2017/model3d" xmlns:o="urn:schemas-microsoft-com:office:office" xmlns:oel="http://schemas.microsoft.com/office/2019/extlst" xmlns:r="http://schemas.openxmlformats.org/officeDocument/2006/relationships" xmlns:m="http://schemas.openxmlformats.org/officeDocument/2006/math" xmlns:v="urn:schemas-microsoft-com:vml" xmlns:wp14="http://schemas.microsoft.com/office/word/2010/wordprocessingDrawing" xmlns:wp="http://schemas.openxmlformats.org/drawingml/2006/wordprocessingDrawing" xmlns:w10="urn:schemas-microsoft-com:office:word" xmlns:w="http://schemas.openxmlformats.org/wordprocessingml/2006/main" xmlns:w14="http://schemas.microsoft.com/office/word/2010/wordml" xmlns:w15="http://schemas.microsoft.com/office/word/2012/wordml" xmlns:w16cex="http://schemas.microsoft.com/office/word/2018/wordml/cex" xmlns:w16cid="http://schemas.microsoft.com/office/word/2016/wordml/cid" xmlns:w16="http://schemas.microsoft.com/office/word/2018/wordml" xmlns:w16du="http://schemas.microsoft.com/office/word/2023/wordml/word16du" xmlns:w16sdtdh="http://schemas.microsoft.com/office/word/2020/wordml/sdtdatahash" xmlns:w16sdtfl="http://schemas.microsoft.com/office/word/2024/wordml/sdtformatlock" xmlns:w16se="http://schemas.microsoft.com/office/word/2015/wordml/symex" xmlns:wpg="http://schemas.microsoft.com/office/word/2010/wordprocessingGroup" xmlns:wpi="http://schemas.microsoft.com/office/word/2010/wordprocessingInk" xmlns:wne="http://schemas.microsoft.com/office/word/2006/wordml" xmlns:wps="http://schemas.microsoft.com/office/word/2010/wordprocessingShape" mc:Ignorable="w14 w15 w16se w16cid w16 w16cex w16sdtdh w16sdtfl w16du wp14">
+<w:numbering xmlns:wpc="http://schemas.microsoft.com/office/word/2010/wordprocessingCanvas" xmlns:cx="http://schemas.microsoft.com/office/drawing/2014/chartex" xmlns:cx1="http://schemas.microsoft.com/office/drawing/2015/9/8/chartex" xmlns:cx2="http://schemas.microsoft.com/office/drawing/2015/10/21/chartex" xmlns:cx3="http://schemas.microsoft.com/office/drawing/2016/5/9/chartex" xmlns:cx4="http://schemas.microsoft.com/office/drawing/2016/5/10/chartex" xmlns:cx5="http://schemas.microsoft.com/office/drawing/2016/5/11/chartex" xmlns:cx6="http://schemas.microsoft.com/office/drawing/2016/5/12/chartex" xmlns:cx7="http://schemas.microsoft.com/office/drawing/2016/5/13/chartex" xmlns:cx8="http://schemas.microsoft.com/office/drawing/2016/5/14/chartex" xmlns:mc="http://schemas.openxmlformats.org/markup-compatibility/2006" xmlns:m="http://schemas.openxmlformats.org/officeDocument/2006/math" xmlns:aink="http://schemas.microsoft.com/office/drawing/2016/ink" xmlns:am3d="http://schemas.microsoft.com/office/drawing/2017/model3d" xmlns:oel="http://schemas.microsoft.com/office/2019/extlst" xmlns:r="http://schemas.openxmlformats.org/officeDocument/2006/relationships" xmlns:wp14="http://schemas.microsoft.com/office/word/2010/wordprocessingDrawing" xmlns:wp="http://schemas.openxmlformats.org/drawingml/2006/wordprocessingDrawing" xmlns:wpg="http://schemas.microsoft.com/office/word/2010/wordprocessingGroup" xmlns:wpi="http://schemas.microsoft.com/office/word/2010/wordprocessingInk" xmlns:wps="http://schemas.microsoft.com/office/word/2010/wordprocessingShape" xmlns:o="urn:schemas-microsoft-com:office:office" xmlns:v="urn:schemas-microsoft-com:vml" xmlns:w10="urn:schemas-microsoft-com:office:word" xmlns:w="http://schemas.openxmlformats.org/wordprocessingml/2006/main" xmlns:w14="http://schemas.microsoft.com/office/word/2010/wordml" xmlns:w15="http://schemas.microsoft.com/office/word/2012/wordml" xmlns:w16cex="http://schemas.microsoft.com/office/word/2018/wordml/cex" xmlns:w16cid="http://schemas.microsoft.com/office/word/2016/wordml/cid" xmlns:w16="http://schemas.microsoft.com/office/word/2018/wordml" xmlns:w16sdtdh="http://schemas.microsoft.com/office/word/2020/wordml/sdtdatahash" xmlns:w16sdtfl="http://schemas.microsoft.com/office/word/2024/wordml/sdtformatlock" xmlns:w16se="http://schemas.microsoft.com/office/word/2015/wordml/symex" xmlns:w16du="http://schemas.microsoft.com/office/word/2023/wordml/word16du" xmlns:wne="http://schemas.microsoft.com/office/word/2006/wordml" mc:Ignorable="w14 w15 w16se w16cid w16 w16cex w16sdtdh w16sdtfl w16du wp14">
   <w:abstractNum w:abstractNumId="0" w15:restartNumberingAfterBreak="0">
     <w:nsid w:val="FFFFFF7C"/>
     <w:multiLevelType w:val="singleLevel"/>
@@ -8012,7 +9032,7 @@
 </file>
 
 <file path=word/styles.xml><?xml version="1.0" encoding="utf-8"?>
-<w:styles xmlns:mc="http://schemas.openxmlformats.org/markup-compatibility/2006" xmlns:r="http://schemas.openxmlformats.org/officeDocument/2006/relationships" xmlns:w="http://schemas.openxmlformats.org/wordprocessingml/2006/main" xmlns:w14="http://schemas.microsoft.com/office/word/2010/wordml" xmlns:w15="http://schemas.microsoft.com/office/word/2012/wordml" xmlns:w16cex="http://schemas.microsoft.com/office/word/2018/wordml/cex" xmlns:w16cid="http://schemas.microsoft.com/office/word/2016/wordml/cid" xmlns:w16="http://schemas.microsoft.com/office/word/2018/wordml" xmlns:w16du="http://schemas.microsoft.com/office/word/2023/wordml/word16du" xmlns:w16sdtdh="http://schemas.microsoft.com/office/word/2020/wordml/sdtdatahash" xmlns:w16sdtfl="http://schemas.microsoft.com/office/word/2024/wordml/sdtformatlock" xmlns:w16se="http://schemas.microsoft.com/office/word/2015/wordml/symex" mc:Ignorable="w14 w15 w16se w16cid w16 w16cex w16sdtdh w16sdtfl w16du">
+<w:styles xmlns:mc="http://schemas.openxmlformats.org/markup-compatibility/2006" xmlns:r="http://schemas.openxmlformats.org/officeDocument/2006/relationships" xmlns:w="http://schemas.openxmlformats.org/wordprocessingml/2006/main" xmlns:w14="http://schemas.microsoft.com/office/word/2010/wordml" xmlns:w15="http://schemas.microsoft.com/office/word/2012/wordml" xmlns:w16cex="http://schemas.microsoft.com/office/word/2018/wordml/cex" xmlns:w16cid="http://schemas.microsoft.com/office/word/2016/wordml/cid" xmlns:w16="http://schemas.microsoft.com/office/word/2018/wordml" xmlns:w16sdtdh="http://schemas.microsoft.com/office/word/2020/wordml/sdtdatahash" xmlns:w16sdtfl="http://schemas.microsoft.com/office/word/2024/wordml/sdtformatlock" xmlns:w16se="http://schemas.microsoft.com/office/word/2015/wordml/symex" xmlns:w16du="http://schemas.microsoft.com/office/word/2023/wordml/word16du" mc:Ignorable="w14 w15 w16se w16cid w16 w16cex w16sdtdh w16sdtfl w16du">
   <w:docDefaults>
     <w:rPrDefault>
       <w:rPr>
@@ -19403,6 +20423,30 @@
     <w:unhideWhenUsed/>
     <w:rsid w:val="00EC49E7"/>
   </w:style>
+  <w:style w:type="paragraph" w:customStyle="1" w:styleId="p1">
+    <w:name w:val="p1"/>
+    <w:basedOn w:val="Normal"/>
+    <w:rsid w:val="009A1F46"/>
+    <w:pPr>
+      <w:spacing w:before="100" w:beforeAutospacing="1" w:after="100" w:afterAutospacing="1" w:line="240" w:lineRule="auto"/>
+    </w:pPr>
+    <w:rPr>
+      <w:rFonts w:ascii="Times New Roman" w:eastAsia="Times New Roman" w:hAnsi="Times New Roman" w:cs="Times New Roman"/>
+      <w:sz w:val="24"/>
+      <w:szCs w:val="24"/>
+      <w:lang w:val="en-GB" w:eastAsia="en-GB"/>
+    </w:rPr>
+  </w:style>
+  <w:style w:type="character" w:customStyle="1" w:styleId="s1">
+    <w:name w:val="s1"/>
+    <w:basedOn w:val="DefaultParagraphFont"/>
+    <w:rsid w:val="00C25DB0"/>
+  </w:style>
+  <w:style w:type="character" w:customStyle="1" w:styleId="apple-converted-space">
+    <w:name w:val="apple-converted-space"/>
+    <w:basedOn w:val="DefaultParagraphFont"/>
+    <w:rsid w:val="009F03D7"/>
+  </w:style>
 </w:styles>
 </file>
 

</xml_diff>